<commit_message>
chore: restore models and reset logs
</commit_message>
<xml_diff>
--- a/Models/SARL/SARL_2026-03_Annonce-Legale-Journal_Template.docx
+++ b/Models/SARL/SARL_2026-03_Annonce-Legale-Journal_Template.docx
@@ -1,6 +1,6 @@
 
 <file path=word/document.xml><?xml version="1.0" encoding="utf-8"?>
-<w:document xmlns:wpc="http://schemas.microsoft.com/office/word/2010/wordprocessingCanvas" xmlns:cx="http://schemas.microsoft.com/office/drawing/2014/chartex" xmlns:cx1="http://schemas.microsoft.com/office/drawing/2015/9/8/chartex" xmlns:cx2="http://schemas.microsoft.com/office/drawing/2015/10/21/chartex" xmlns:cx3="http://schemas.microsoft.com/office/drawing/2016/5/9/chartex" xmlns:cx4="http://schemas.microsoft.com/office/drawing/2016/5/10/chartex" xmlns:cx5="http://schemas.microsoft.com/office/drawing/2016/5/11/chartex" xmlns:cx6="http://schemas.microsoft.com/office/drawing/2016/5/12/chartex" xmlns:cx7="http://schemas.microsoft.com/office/drawing/2016/5/13/chartex" xmlns:cx8="http://schemas.microsoft.com/office/drawing/2016/5/14/chartex" xmlns:mc="http://schemas.openxmlformats.org/markup-compatibility/2006" xmlns:aink="http://schemas.microsoft.com/office/drawing/2016/ink" xmlns:am3d="http://schemas.microsoft.com/office/drawing/2017/model3d" xmlns:o="urn:schemas-microsoft-com:office:office" xmlns:oel="http://schemas.microsoft.com/office/2019/extlst" xmlns:r="http://schemas.openxmlformats.org/officeDocument/2006/relationships" xmlns:m="http://schemas.openxmlformats.org/officeDocument/2006/math" xmlns:v="urn:schemas-microsoft-com:vml" xmlns:wp14="http://schemas.microsoft.com/office/word/2010/wordprocessingDrawing" xmlns:wp="http://schemas.openxmlformats.org/drawingml/2006/wordprocessingDrawing" xmlns:w10="urn:schemas-microsoft-com:office:word" xmlns:w="http://schemas.openxmlformats.org/wordprocessingml/2006/main" xmlns:w14="http://schemas.microsoft.com/office/word/2010/wordml" xmlns:w15="http://schemas.microsoft.com/office/word/2012/wordml" xmlns:w16cex="http://schemas.microsoft.com/office/word/2018/wordml/cex" xmlns:w16cid="http://schemas.microsoft.com/office/word/2016/wordml/cid" xmlns:w16="http://schemas.microsoft.com/office/word/2018/wordml" xmlns:w16du="http://schemas.microsoft.com/office/word/2023/wordml/word16du" xmlns:w16sdtdh="http://schemas.microsoft.com/office/word/2020/wordml/sdtdatahash" xmlns:w16sdtfl="http://schemas.microsoft.com/office/word/2024/wordml/sdtformatlock" xmlns:w16se="http://schemas.microsoft.com/office/word/2015/wordml/symex" xmlns:wpg="http://schemas.microsoft.com/office/word/2010/wordprocessingGroup" xmlns:wpi="http://schemas.microsoft.com/office/word/2010/wordprocessingInk" xmlns:wne="http://schemas.microsoft.com/office/word/2006/wordml" xmlns:wps="http://schemas.microsoft.com/office/word/2010/wordprocessingShape" mc:Ignorable="w14 w15 w16se w16cid w16 w16cex w16sdtdh w16sdtfl w16du wp14">
+<w:document xmlns:wpc="http://schemas.microsoft.com/office/word/2010/wordprocessingCanvas" xmlns:cx="http://schemas.microsoft.com/office/drawing/2014/chartex" xmlns:cx1="http://schemas.microsoft.com/office/drawing/2015/9/8/chartex" xmlns:cx2="http://schemas.microsoft.com/office/drawing/2015/10/21/chartex" xmlns:cx3="http://schemas.microsoft.com/office/drawing/2016/5/9/chartex" xmlns:cx4="http://schemas.microsoft.com/office/drawing/2016/5/10/chartex" xmlns:cx5="http://schemas.microsoft.com/office/drawing/2016/5/11/chartex" xmlns:cx6="http://schemas.microsoft.com/office/drawing/2016/5/12/chartex" xmlns:cx7="http://schemas.microsoft.com/office/drawing/2016/5/13/chartex" xmlns:cx8="http://schemas.microsoft.com/office/drawing/2016/5/14/chartex" xmlns:mc="http://schemas.openxmlformats.org/markup-compatibility/2006" xmlns:aink="http://schemas.microsoft.com/office/drawing/2016/ink" xmlns:am3d="http://schemas.microsoft.com/office/drawing/2017/model3d" xmlns:o="urn:schemas-microsoft-com:office:office" xmlns:oel="http://schemas.microsoft.com/office/2019/extlst" xmlns:r="http://schemas.openxmlformats.org/officeDocument/2006/relationships" xmlns:m="http://schemas.openxmlformats.org/officeDocument/2006/math" xmlns:v="urn:schemas-microsoft-com:vml" xmlns:wp14="http://schemas.microsoft.com/office/word/2010/wordprocessingDrawing" xmlns:wp="http://schemas.openxmlformats.org/drawingml/2006/wordprocessingDrawing" xmlns:w10="urn:schemas-microsoft-com:office:word" xmlns:w="http://schemas.openxmlformats.org/wordprocessingml/2006/main" xmlns:w14="http://schemas.microsoft.com/office/word/2010/wordml" xmlns:w15="http://schemas.microsoft.com/office/word/2012/wordml" xmlns:w16cex="http://schemas.microsoft.com/office/word/2018/wordml/cex" xmlns:w16cid="http://schemas.microsoft.com/office/word/2016/wordml/cid" xmlns:w16="http://schemas.microsoft.com/office/word/2018/wordml" xmlns:w16sdtdh="http://schemas.microsoft.com/office/word/2020/wordml/sdtdatahash" xmlns:w16se="http://schemas.microsoft.com/office/word/2015/wordml/symex" xmlns:wpg="http://schemas.microsoft.com/office/word/2010/wordprocessingGroup" xmlns:wpi="http://schemas.microsoft.com/office/word/2010/wordprocessingInk" xmlns:wne="http://schemas.microsoft.com/office/word/2006/wordml" xmlns:wps="http://schemas.microsoft.com/office/word/2010/wordprocessingShape" mc:Ignorable="w14 w15 w16se w16cid w16 w16cex w16sdtdh wp14">
   <w:body>
     <w:p>
       <w:pPr>
@@ -9,15 +9,13 @@
         </w:tabs>
         <w:jc w:val="center"/>
         <w:rPr>
-          <w:rFonts w:asciiTheme="minorHAnsi" w:hAnsiTheme="minorHAnsi" w:cstheme="minorHAnsi"/>
-          <w:b/>
-          <w:sz w:val="18"/>
-          <w:szCs w:val="18"/>
-        </w:rPr>
-      </w:pPr>
-      <w:r>
-        <w:rPr>
-          <w:rFonts w:asciiTheme="minorHAnsi" w:hAnsiTheme="minorHAnsi" w:cstheme="minorHAnsi"/>
+          <w:b/>
+          <w:sz w:val="18"/>
+          <w:szCs w:val="18"/>
+        </w:rPr>
+      </w:pPr>
+      <w:r>
+        <w:rPr>
           <w:b/>
           <w:sz w:val="18"/>
           <w:szCs w:val="18"/>
@@ -32,15 +30,13 @@
         </w:tabs>
         <w:jc w:val="center"/>
         <w:rPr>
-          <w:rFonts w:asciiTheme="minorHAnsi" w:hAnsiTheme="minorHAnsi" w:cstheme="minorHAnsi"/>
-          <w:b/>
-          <w:sz w:val="18"/>
-          <w:szCs w:val="18"/>
-        </w:rPr>
-      </w:pPr>
-      <w:r>
-        <w:rPr>
-          <w:rFonts w:asciiTheme="minorHAnsi" w:hAnsiTheme="minorHAnsi" w:cstheme="minorHAnsi"/>
+          <w:b/>
+          <w:sz w:val="18"/>
+          <w:szCs w:val="18"/>
+        </w:rPr>
+      </w:pPr>
+      <w:r>
+        <w:rPr>
           <w:b/>
           <w:sz w:val="18"/>
           <w:szCs w:val="18"/>
@@ -49,100 +45,34 @@
       </w:r>
       <w:r>
         <w:rPr>
-          <w:rFonts w:asciiTheme="minorHAnsi" w:hAnsiTheme="minorHAnsi" w:cstheme="minorHAnsi"/>
           <w:b/>
           <w:sz w:val="18"/>
           <w:szCs w:val="18"/>
         </w:rPr>
         <w:t xml:space="preserve"> </w:t>
       </w:r>
-      <w:proofErr w:type="gramStart"/>
-      <w:r>
-        <w:rPr>
-          <w:rFonts w:asciiTheme="minorHAnsi" w:hAnsiTheme="minorHAnsi" w:cstheme="minorHAnsi"/>
-          <w:b/>
-          <w:sz w:val="18"/>
-          <w:szCs w:val="18"/>
-        </w:rPr>
-        <w:t>{{ DENOMINATION</w:t>
-      </w:r>
-      <w:proofErr w:type="gramEnd"/>
-      <w:r>
-        <w:rPr>
-          <w:rFonts w:asciiTheme="minorHAnsi" w:hAnsiTheme="minorHAnsi" w:cstheme="minorHAnsi"/>
-          <w:b/>
-          <w:sz w:val="18"/>
-          <w:szCs w:val="18"/>
-        </w:rPr>
-        <w:t>_</w:t>
-      </w:r>
-      <w:proofErr w:type="gramStart"/>
-      <w:r>
-        <w:rPr>
-          <w:rFonts w:asciiTheme="minorHAnsi" w:hAnsiTheme="minorHAnsi" w:cstheme="minorHAnsi"/>
-          <w:b/>
-          <w:sz w:val="18"/>
-          <w:szCs w:val="18"/>
-        </w:rPr>
-        <w:t>SOCIALE }</w:t>
-      </w:r>
-      <w:proofErr w:type="gramEnd"/>
-      <w:r>
-        <w:rPr>
-          <w:rFonts w:asciiTheme="minorHAnsi" w:hAnsiTheme="minorHAnsi" w:cstheme="minorHAnsi"/>
-          <w:b/>
-          <w:sz w:val="18"/>
-          <w:szCs w:val="18"/>
-        </w:rPr>
-        <w:t xml:space="preserve">} </w:t>
-      </w:r>
-      <w:proofErr w:type="gramStart"/>
-      <w:r>
-        <w:rPr>
-          <w:rFonts w:asciiTheme="minorHAnsi" w:hAnsiTheme="minorHAnsi" w:cstheme="minorHAnsi"/>
-          <w:b/>
-          <w:sz w:val="18"/>
-          <w:szCs w:val="18"/>
-        </w:rPr>
-        <w:t>{{ FORME</w:t>
-      </w:r>
-      <w:proofErr w:type="gramEnd"/>
-      <w:r>
-        <w:rPr>
-          <w:rFonts w:asciiTheme="minorHAnsi" w:hAnsiTheme="minorHAnsi" w:cstheme="minorHAnsi"/>
-          <w:b/>
-          <w:sz w:val="18"/>
-          <w:szCs w:val="18"/>
-        </w:rPr>
-        <w:t>_</w:t>
-      </w:r>
-      <w:proofErr w:type="gramStart"/>
-      <w:r>
-        <w:rPr>
-          <w:rFonts w:asciiTheme="minorHAnsi" w:hAnsiTheme="minorHAnsi" w:cstheme="minorHAnsi"/>
-          <w:b/>
-          <w:sz w:val="18"/>
-          <w:szCs w:val="18"/>
-        </w:rPr>
-        <w:t>JURIDIQUE }}</w:t>
-      </w:r>
-      <w:r>
-        <w:rPr>
-          <w:rFonts w:asciiTheme="minorHAnsi" w:hAnsiTheme="minorHAnsi" w:cstheme="minorHAnsi"/>
+      <w:r>
+        <w:rPr>
+          <w:b/>
+          <w:sz w:val="18"/>
+          <w:szCs w:val="18"/>
+        </w:rPr>
+        <w:t>{{ DENOMINATION_SOCIALE }} {{ FORME_JURIDIQUE }}</w:t>
+      </w:r>
+      <w:r>
+        <w:rPr>
           <w:b/>
           <w:sz w:val="18"/>
           <w:szCs w:val="18"/>
         </w:rPr>
         <w:t>"</w:t>
       </w:r>
-      <w:proofErr w:type="gramEnd"/>
     </w:p>
     <w:p>
       <w:pPr>
         <w:ind w:left="-142"/>
         <w:jc w:val="both"/>
         <w:rPr>
-          <w:rFonts w:asciiTheme="minorHAnsi" w:hAnsiTheme="minorHAnsi" w:cstheme="minorHAnsi"/>
           <w:b/>
           <w:sz w:val="18"/>
           <w:szCs w:val="18"/>
@@ -154,15 +84,15 @@
       <w:pPr>
         <w:jc w:val="both"/>
         <w:rPr>
-          <w:rFonts w:asciiTheme="minorHAnsi" w:hAnsiTheme="minorHAnsi" w:cstheme="minorHAnsi"/>
-          <w:bCs/>
-          <w:sz w:val="18"/>
-          <w:szCs w:val="18"/>
-        </w:rPr>
-      </w:pPr>
-      <w:r>
-        <w:rPr>
-          <w:rFonts w:asciiTheme="minorHAnsi" w:hAnsiTheme="minorHAnsi" w:cstheme="minorHAnsi"/>
+          <w:rFonts w:asciiTheme="majorBidi" w:hAnsiTheme="majorBidi" w:cstheme="majorBidi"/>
+          <w:bCs/>
+          <w:sz w:val="18"/>
+          <w:szCs w:val="18"/>
+        </w:rPr>
+      </w:pPr>
+      <w:r>
+        <w:rPr>
+          <w:rFonts w:asciiTheme="majorBidi" w:hAnsiTheme="majorBidi" w:cstheme="majorBidi"/>
           <w:b/>
           <w:sz w:val="18"/>
           <w:szCs w:val="18"/>
@@ -171,7 +101,7 @@
       </w:r>
       <w:r>
         <w:rPr>
-          <w:rFonts w:asciiTheme="minorHAnsi" w:hAnsiTheme="minorHAnsi" w:cstheme="minorHAnsi"/>
+          <w:rFonts w:asciiTheme="majorBidi" w:hAnsiTheme="majorBidi" w:cstheme="majorBidi"/>
           <w:bCs/>
           <w:sz w:val="18"/>
           <w:szCs w:val="18"/>
@@ -180,7 +110,7 @@
       </w:r>
       <w:r>
         <w:rPr>
-          <w:rFonts w:asciiTheme="minorHAnsi" w:hAnsiTheme="minorHAnsi" w:cstheme="minorHAnsi"/>
+          <w:rFonts w:asciiTheme="majorBidi" w:hAnsiTheme="majorBidi" w:cstheme="majorBidi"/>
           <w:bCs/>
           <w:sz w:val="18"/>
           <w:szCs w:val="18"/>
@@ -189,7 +119,7 @@
       </w:r>
       <w:r>
         <w:rPr>
-          <w:rFonts w:asciiTheme="minorHAnsi" w:hAnsiTheme="minorHAnsi" w:cstheme="minorHAnsi"/>
+          <w:rFonts w:asciiTheme="majorBidi" w:hAnsiTheme="majorBidi" w:cstheme="majorBidi"/>
           <w:bCs/>
           <w:sz w:val="18"/>
           <w:szCs w:val="18"/>
@@ -198,56 +128,25 @@
       </w:r>
       <w:r>
         <w:rPr>
-          <w:rFonts w:asciiTheme="minorHAnsi" w:hAnsiTheme="minorHAnsi" w:cstheme="minorHAnsi"/>
+          <w:rFonts w:asciiTheme="majorBidi" w:hAnsiTheme="majorBidi" w:cstheme="majorBidi"/>
           <w:bCs/>
           <w:sz w:val="18"/>
           <w:szCs w:val="18"/>
         </w:rPr>
         <w:t xml:space="preserve"> </w:t>
       </w:r>
-      <w:proofErr w:type="gramStart"/>
-      <w:r>
-        <w:rPr>
-          <w:rFonts w:asciiTheme="minorHAnsi" w:hAnsiTheme="minorHAnsi" w:cstheme="minorHAnsi"/>
-          <w:b/>
-          <w:sz w:val="18"/>
-          <w:szCs w:val="18"/>
-        </w:rPr>
-        <w:t>{{ DTAE</w:t>
-      </w:r>
-      <w:proofErr w:type="gramEnd"/>
-      <w:r>
-        <w:rPr>
-          <w:rFonts w:asciiTheme="minorHAnsi" w:hAnsiTheme="minorHAnsi" w:cstheme="minorHAnsi"/>
-          <w:b/>
-          <w:sz w:val="18"/>
-          <w:szCs w:val="18"/>
-        </w:rPr>
-        <w:t>_</w:t>
-      </w:r>
-      <w:proofErr w:type="gramStart"/>
-      <w:r>
-        <w:rPr>
-          <w:rFonts w:asciiTheme="minorHAnsi" w:hAnsiTheme="minorHAnsi" w:cstheme="minorHAnsi"/>
-          <w:b/>
-          <w:sz w:val="18"/>
-          <w:szCs w:val="18"/>
-        </w:rPr>
-        <w:t>CONTRAT }</w:t>
-      </w:r>
-      <w:proofErr w:type="gramEnd"/>
-      <w:r>
-        <w:rPr>
-          <w:rFonts w:asciiTheme="minorHAnsi" w:hAnsiTheme="minorHAnsi" w:cstheme="minorHAnsi"/>
-          <w:b/>
-          <w:sz w:val="18"/>
-          <w:szCs w:val="18"/>
-        </w:rPr>
-        <w:t>}</w:t>
-      </w:r>
-      <w:r>
-        <w:rPr>
-          <w:rFonts w:asciiTheme="minorHAnsi" w:hAnsiTheme="minorHAnsi" w:cstheme="minorHAnsi"/>
+      <w:r>
+        <w:rPr>
+          <w:rFonts w:asciiTheme="majorBidi" w:hAnsiTheme="majorBidi" w:cstheme="majorBidi"/>
+          <w:b/>
+          <w:sz w:val="18"/>
+          <w:szCs w:val="18"/>
+        </w:rPr>
+        <w:t>{{ DTAE_CONTRAT }}</w:t>
+      </w:r>
+      <w:r>
+        <w:rPr>
+          <w:rFonts w:asciiTheme="majorBidi" w:hAnsiTheme="majorBidi" w:cstheme="majorBidi"/>
           <w:b/>
           <w:sz w:val="18"/>
           <w:szCs w:val="18"/>
@@ -256,7 +155,7 @@
       </w:r>
       <w:r>
         <w:rPr>
-          <w:rFonts w:asciiTheme="minorHAnsi" w:hAnsiTheme="minorHAnsi" w:cstheme="minorHAnsi"/>
+          <w:rFonts w:asciiTheme="majorBidi" w:hAnsiTheme="majorBidi" w:cstheme="majorBidi"/>
           <w:bCs/>
           <w:sz w:val="18"/>
           <w:szCs w:val="18"/>
@@ -265,7 +164,7 @@
       </w:r>
       <w:r>
         <w:rPr>
-          <w:rFonts w:asciiTheme="minorHAnsi" w:hAnsiTheme="minorHAnsi" w:cstheme="minorHAnsi"/>
+          <w:rFonts w:asciiTheme="majorBidi" w:hAnsiTheme="majorBidi" w:cstheme="majorBidi"/>
           <w:bCs/>
           <w:sz w:val="18"/>
           <w:szCs w:val="18"/>
@@ -274,7 +173,7 @@
       </w:r>
       <w:r>
         <w:rPr>
-          <w:rFonts w:asciiTheme="minorHAnsi" w:hAnsiTheme="minorHAnsi" w:cstheme="minorHAnsi"/>
+          <w:rFonts w:asciiTheme="majorBidi" w:hAnsiTheme="majorBidi" w:cstheme="majorBidi"/>
           <w:bCs/>
           <w:sz w:val="18"/>
           <w:szCs w:val="18"/>
@@ -283,56 +182,43 @@
       </w:r>
       <w:r>
         <w:rPr>
-          <w:rFonts w:asciiTheme="minorHAnsi" w:hAnsiTheme="minorHAnsi" w:cstheme="minorHAnsi"/>
-          <w:bCs/>
-          <w:sz w:val="18"/>
-          <w:szCs w:val="18"/>
-        </w:rPr>
-        <w:t xml:space="preserve"> Statuts d’une </w:t>
-      </w:r>
-      <w:proofErr w:type="gramStart"/>
-      <w:r>
-        <w:rPr>
-          <w:rFonts w:asciiTheme="minorHAnsi" w:hAnsiTheme="minorHAnsi" w:cstheme="minorHAnsi"/>
-          <w:bCs/>
-          <w:sz w:val="18"/>
-          <w:szCs w:val="18"/>
-        </w:rPr>
-        <w:t>{{ FORME</w:t>
-      </w:r>
-      <w:proofErr w:type="gramEnd"/>
-      <w:r>
-        <w:rPr>
-          <w:rFonts w:asciiTheme="minorHAnsi" w:hAnsiTheme="minorHAnsi" w:cstheme="minorHAnsi"/>
-          <w:bCs/>
-          <w:sz w:val="18"/>
-          <w:szCs w:val="18"/>
-        </w:rPr>
-        <w:t>_</w:t>
-      </w:r>
-      <w:proofErr w:type="gramStart"/>
-      <w:r>
-        <w:rPr>
-          <w:rFonts w:asciiTheme="minorHAnsi" w:hAnsiTheme="minorHAnsi" w:cstheme="minorHAnsi"/>
-          <w:bCs/>
-          <w:sz w:val="18"/>
-          <w:szCs w:val="18"/>
-        </w:rPr>
-        <w:t>JURIDIQUE }</w:t>
-      </w:r>
-      <w:proofErr w:type="gramEnd"/>
-      <w:r>
-        <w:rPr>
-          <w:rFonts w:asciiTheme="minorHAnsi" w:hAnsiTheme="minorHAnsi" w:cstheme="minorHAnsi"/>
-          <w:bCs/>
-          <w:sz w:val="18"/>
-          <w:szCs w:val="18"/>
-        </w:rPr>
-        <w:t xml:space="preserve">} </w:t>
-      </w:r>
-      <w:r>
-        <w:rPr>
-          <w:rFonts w:asciiTheme="minorHAnsi" w:hAnsiTheme="minorHAnsi" w:cstheme="minorHAnsi"/>
+          <w:rFonts w:asciiTheme="majorBidi" w:hAnsiTheme="majorBidi" w:cstheme="majorBidi"/>
+          <w:bCs/>
+          <w:sz w:val="18"/>
+          <w:szCs w:val="18"/>
+        </w:rPr>
+        <w:t xml:space="preserve"> Statuts </w:t>
+      </w:r>
+      <w:r>
+        <w:rPr>
+          <w:rFonts w:asciiTheme="majorBidi" w:hAnsiTheme="majorBidi" w:cstheme="majorBidi"/>
+          <w:bCs/>
+          <w:sz w:val="18"/>
+          <w:szCs w:val="18"/>
+        </w:rPr>
+        <w:t xml:space="preserve">d’une </w:t>
+      </w:r>
+      <w:r>
+        <w:rPr>
+          <w:rFonts w:asciiTheme="majorBidi" w:hAnsiTheme="majorBidi" w:cstheme="majorBidi"/>
+          <w:bCs/>
+          <w:sz w:val="18"/>
+          <w:szCs w:val="18"/>
+        </w:rPr>
+        <w:t>{{ FORME_JURIDIQUE }}</w:t>
+      </w:r>
+      <w:r>
+        <w:rPr>
+          <w:rFonts w:asciiTheme="majorBidi" w:hAnsiTheme="majorBidi" w:cstheme="majorBidi"/>
+          <w:bCs/>
+          <w:sz w:val="18"/>
+          <w:szCs w:val="18"/>
+        </w:rPr>
+        <w:t xml:space="preserve"> </w:t>
+      </w:r>
+      <w:r>
+        <w:rPr>
+          <w:rFonts w:asciiTheme="majorBidi" w:hAnsiTheme="majorBidi" w:cstheme="majorBidi"/>
           <w:bCs/>
           <w:sz w:val="18"/>
           <w:szCs w:val="18"/>
@@ -341,7 +227,7 @@
       </w:r>
       <w:r>
         <w:rPr>
-          <w:rFonts w:asciiTheme="minorHAnsi" w:hAnsiTheme="minorHAnsi" w:cstheme="minorHAnsi"/>
+          <w:rFonts w:asciiTheme="majorBidi" w:hAnsiTheme="majorBidi" w:cstheme="majorBidi"/>
           <w:bCs/>
           <w:sz w:val="18"/>
           <w:szCs w:val="18"/>
@@ -359,15 +245,15 @@
         <w:ind w:left="567"/>
         <w:jc w:val="both"/>
         <w:rPr>
-          <w:rFonts w:asciiTheme="minorHAnsi" w:hAnsiTheme="minorHAnsi" w:cstheme="minorHAnsi"/>
-          <w:bCs/>
-          <w:sz w:val="18"/>
-          <w:szCs w:val="18"/>
-        </w:rPr>
-      </w:pPr>
-      <w:r>
-        <w:rPr>
-          <w:rFonts w:asciiTheme="minorHAnsi" w:hAnsiTheme="minorHAnsi" w:cstheme="minorHAnsi"/>
+          <w:rFonts w:asciiTheme="majorBidi" w:hAnsiTheme="majorBidi" w:cstheme="majorBidi"/>
+          <w:bCs/>
+          <w:sz w:val="18"/>
+          <w:szCs w:val="18"/>
+        </w:rPr>
+      </w:pPr>
+      <w:r>
+        <w:rPr>
+          <w:rFonts w:asciiTheme="majorBidi" w:hAnsiTheme="majorBidi" w:cstheme="majorBidi"/>
           <w:b/>
           <w:bCs/>
           <w:sz w:val="18"/>
@@ -377,47 +263,24 @@
       </w:r>
       <w:r>
         <w:rPr>
-          <w:rFonts w:asciiTheme="minorHAnsi" w:hAnsiTheme="minorHAnsi" w:cstheme="minorHAnsi"/>
           <w:sz w:val="18"/>
           <w:szCs w:val="18"/>
         </w:rPr>
         <w:t>« </w:t>
       </w:r>
-      <w:proofErr w:type="gramStart"/>
-      <w:r>
-        <w:rPr>
-          <w:rFonts w:asciiTheme="minorHAnsi" w:hAnsiTheme="minorHAnsi" w:cstheme="minorHAnsi"/>
-          <w:sz w:val="18"/>
-          <w:szCs w:val="18"/>
-        </w:rPr>
-        <w:t>{{ DENOMINATION</w:t>
-      </w:r>
-      <w:proofErr w:type="gramEnd"/>
-      <w:r>
-        <w:rPr>
-          <w:rFonts w:asciiTheme="minorHAnsi" w:hAnsiTheme="minorHAnsi" w:cstheme="minorHAnsi"/>
-          <w:sz w:val="18"/>
-          <w:szCs w:val="18"/>
-        </w:rPr>
-        <w:t>_</w:t>
-      </w:r>
-      <w:proofErr w:type="gramStart"/>
-      <w:r>
-        <w:rPr>
-          <w:rFonts w:asciiTheme="minorHAnsi" w:hAnsiTheme="minorHAnsi" w:cstheme="minorHAnsi"/>
-          <w:sz w:val="18"/>
-          <w:szCs w:val="18"/>
-        </w:rPr>
-        <w:t>SOCIALE }</w:t>
-      </w:r>
-      <w:proofErr w:type="gramEnd"/>
-      <w:r>
-        <w:rPr>
-          <w:rFonts w:asciiTheme="minorHAnsi" w:hAnsiTheme="minorHAnsi" w:cstheme="minorHAnsi"/>
-          <w:sz w:val="18"/>
-          <w:szCs w:val="18"/>
-        </w:rPr>
-        <w:t>} »</w:t>
+      <w:r>
+        <w:rPr>
+          <w:sz w:val="18"/>
+          <w:szCs w:val="18"/>
+        </w:rPr>
+        <w:t>{{ DENOMINATION_SOCIALE }}</w:t>
+      </w:r>
+      <w:r>
+        <w:rPr>
+          <w:sz w:val="18"/>
+          <w:szCs w:val="18"/>
+        </w:rPr>
+        <w:t> »</w:t>
       </w:r>
     </w:p>
     <w:p>
@@ -430,123 +293,149 @@
         <w:ind w:left="567"/>
         <w:jc w:val="both"/>
         <w:rPr>
-          <w:rFonts w:asciiTheme="minorHAnsi" w:hAnsiTheme="minorHAnsi" w:cstheme="minorHAnsi"/>
-          <w:b/>
-          <w:sz w:val="18"/>
-          <w:szCs w:val="18"/>
-          <w:lang w:val="en-US"/>
-        </w:rPr>
-      </w:pPr>
-      <w:proofErr w:type="spellStart"/>
-      <w:r>
-        <w:rPr>
-          <w:rFonts w:asciiTheme="minorHAnsi" w:hAnsiTheme="minorHAnsi" w:cstheme="minorHAnsi"/>
-          <w:b/>
-          <w:sz w:val="18"/>
-          <w:szCs w:val="18"/>
-          <w:lang w:val="en-US"/>
+          <w:rFonts w:asciiTheme="majorBidi" w:hAnsiTheme="majorBidi" w:cstheme="majorBidi"/>
+          <w:bCs/>
+          <w:sz w:val="18"/>
+          <w:szCs w:val="18"/>
+        </w:rPr>
+      </w:pPr>
+      <w:r>
+        <w:rPr>
+          <w:rFonts w:asciiTheme="majorBidi" w:hAnsiTheme="majorBidi" w:cstheme="majorBidi"/>
+          <w:b/>
+          <w:sz w:val="18"/>
+          <w:szCs w:val="18"/>
         </w:rPr>
         <w:t>Objet</w:t>
       </w:r>
-      <w:proofErr w:type="spellEnd"/>
-      <w:r>
-        <w:rPr>
-          <w:rFonts w:asciiTheme="minorHAnsi" w:hAnsiTheme="minorHAnsi" w:cstheme="minorHAnsi"/>
-          <w:bCs/>
-          <w:sz w:val="18"/>
-          <w:szCs w:val="18"/>
-          <w:lang w:val="en-US"/>
+      <w:r>
+        <w:rPr>
+          <w:rFonts w:asciiTheme="majorBidi" w:hAnsiTheme="majorBidi" w:cstheme="majorBidi"/>
+          <w:bCs/>
+          <w:sz w:val="18"/>
+          <w:szCs w:val="18"/>
         </w:rPr>
         <w:t> </w:t>
       </w:r>
       <w:r>
         <w:rPr>
-          <w:rFonts w:asciiTheme="minorHAnsi" w:hAnsiTheme="minorHAnsi" w:cstheme="minorHAnsi"/>
-          <w:b/>
-          <w:sz w:val="18"/>
-          <w:szCs w:val="18"/>
-          <w:lang w:val="en-US"/>
+          <w:rFonts w:asciiTheme="majorBidi" w:hAnsiTheme="majorBidi" w:cstheme="majorBidi"/>
+          <w:b/>
+          <w:sz w:val="18"/>
+          <w:szCs w:val="18"/>
         </w:rPr>
         <w:t xml:space="preserve">: </w:t>
       </w:r>
       <w:r>
         <w:rPr>
-          <w:rFonts w:asciiTheme="minorHAnsi" w:hAnsiTheme="minorHAnsi" w:cstheme="minorHAnsi"/>
-          <w:b/>
-          <w:sz w:val="18"/>
-          <w:szCs w:val="18"/>
-          <w:lang w:val="en-US"/>
-        </w:rPr>
-        <w:t>{%p for a in ACTIVITES_LIST %}</w:t>
-      </w:r>
-      <w:r>
-        <w:rPr>
-          <w:rFonts w:asciiTheme="minorHAnsi" w:hAnsiTheme="minorHAnsi" w:cstheme="minorHAnsi"/>
-          <w:b/>
-          <w:sz w:val="18"/>
-          <w:szCs w:val="18"/>
-          <w:lang w:val="en-US"/>
-        </w:rPr>
+          <w:rFonts w:asciiTheme="majorBidi" w:hAnsiTheme="majorBidi" w:cstheme="majorBidi"/>
+          <w:bCs/>
+          <w:sz w:val="18"/>
+          <w:szCs w:val="18"/>
+        </w:rPr>
+        <w:t>{{ ACTIVITY1 }}</w:t>
+      </w:r>
+      <w:r>
+        <w:rPr>
+          <w:rFonts w:asciiTheme="majorBidi" w:hAnsiTheme="majorBidi" w:cstheme="majorBidi"/>
+          <w:bCs/>
+          <w:sz w:val="18"/>
+          <w:szCs w:val="18"/>
+        </w:rPr>
+        <w:t> ;</w:t>
+      </w:r>
+      <w:r>
         <w:t xml:space="preserve"> </w:t>
       </w:r>
       <w:r>
         <w:rPr>
-          <w:rFonts w:asciiTheme="minorHAnsi" w:hAnsiTheme="minorHAnsi" w:cstheme="minorHAnsi"/>
-          <w:b/>
-          <w:sz w:val="18"/>
-          <w:szCs w:val="18"/>
-          <w:lang w:val="en-US"/>
-        </w:rPr>
-        <w:t>{{ a }}</w:t>
-      </w:r>
-      <w:r>
-        <w:rPr>
-          <w:rFonts w:asciiTheme="minorHAnsi" w:hAnsiTheme="minorHAnsi" w:cstheme="minorHAnsi"/>
-          <w:b/>
-          <w:sz w:val="18"/>
-          <w:szCs w:val="18"/>
-          <w:lang w:val="en-US"/>
-        </w:rPr>
-        <w:t>,</w:t>
-      </w:r>
-      <w:r>
-        <w:rPr>
-          <w:rFonts w:asciiTheme="minorHAnsi" w:hAnsiTheme="minorHAnsi" w:cstheme="minorHAnsi"/>
-          <w:b/>
-          <w:sz w:val="18"/>
-          <w:szCs w:val="18"/>
-          <w:lang w:val="en-US"/>
-        </w:rPr>
+          <w:rFonts w:asciiTheme="majorBidi" w:hAnsiTheme="majorBidi" w:cstheme="majorBidi"/>
+          <w:bCs/>
+          <w:sz w:val="18"/>
+          <w:szCs w:val="18"/>
+        </w:rPr>
+        <w:t>{{ ACTIVITY2 }}</w:t>
+      </w:r>
+      <w:r>
+        <w:rPr>
+          <w:rFonts w:asciiTheme="majorBidi" w:hAnsiTheme="majorBidi" w:cstheme="majorBidi"/>
+          <w:bCs/>
+          <w:sz w:val="18"/>
+          <w:szCs w:val="18"/>
+        </w:rPr>
+        <w:t xml:space="preserve"> ; </w:t>
+      </w:r>
+      <w:r>
+        <w:rPr>
+          <w:rFonts w:asciiTheme="majorBidi" w:hAnsiTheme="majorBidi" w:cstheme="majorBidi"/>
+          <w:bCs/>
+          <w:sz w:val="18"/>
+          <w:szCs w:val="18"/>
+        </w:rPr>
+        <w:t>{{ ACTIVITY3 }}</w:t>
+      </w:r>
+      <w:r>
+        <w:rPr>
+          <w:rFonts w:asciiTheme="majorBidi" w:hAnsiTheme="majorBidi" w:cstheme="majorBidi"/>
+          <w:bCs/>
+          <w:sz w:val="18"/>
+          <w:szCs w:val="18"/>
+        </w:rPr>
+        <w:t> ;</w:t>
+      </w:r>
+      <w:r>
         <w:t xml:space="preserve"> </w:t>
       </w:r>
       <w:r>
         <w:rPr>
-          <w:rFonts w:asciiTheme="minorHAnsi" w:hAnsiTheme="minorHAnsi" w:cstheme="minorHAnsi"/>
-          <w:b/>
-          <w:sz w:val="18"/>
-          <w:szCs w:val="18"/>
-        </w:rPr>
-        <w:t xml:space="preserve">{%p </w:t>
-      </w:r>
-      <w:proofErr w:type="spellStart"/>
-      <w:r>
-        <w:rPr>
-          <w:rFonts w:asciiTheme="minorHAnsi" w:hAnsiTheme="minorHAnsi" w:cstheme="minorHAnsi"/>
-          <w:b/>
-          <w:sz w:val="18"/>
-          <w:szCs w:val="18"/>
-        </w:rPr>
-        <w:t>endfor</w:t>
-      </w:r>
-      <w:proofErr w:type="spellEnd"/>
-      <w:r>
-        <w:rPr>
-          <w:rFonts w:asciiTheme="minorHAnsi" w:hAnsiTheme="minorHAnsi" w:cstheme="minorHAnsi"/>
-          <w:b/>
-          <w:sz w:val="18"/>
-          <w:szCs w:val="18"/>
-        </w:rPr>
-        <w:t xml:space="preserve"> %}</w:t>
+          <w:rFonts w:asciiTheme="majorBidi" w:hAnsiTheme="majorBidi" w:cstheme="majorBidi"/>
+          <w:bCs/>
+          <w:sz w:val="18"/>
+          <w:szCs w:val="18"/>
+        </w:rPr>
+        <w:t>{{ ACTIVITY4 }}</w:t>
+      </w:r>
+      <w:r>
+        <w:rPr>
+          <w:rFonts w:asciiTheme="majorBidi" w:hAnsiTheme="majorBidi" w:cstheme="majorBidi"/>
+          <w:bCs/>
+          <w:sz w:val="18"/>
+          <w:szCs w:val="18"/>
+        </w:rPr>
+        <w:t> ;</w:t>
+      </w:r>
+      <w:r>
+        <w:t xml:space="preserve"> </w:t>
+      </w:r>
+      <w:r>
+        <w:rPr>
+          <w:rFonts w:asciiTheme="majorBidi" w:hAnsiTheme="majorBidi" w:cstheme="majorBidi"/>
+          <w:bCs/>
+          <w:sz w:val="18"/>
+          <w:szCs w:val="18"/>
+        </w:rPr>
+        <w:t>{{ ACTIVITY5 }}</w:t>
+      </w:r>
+      <w:r>
+        <w:rPr>
+          <w:rFonts w:asciiTheme="majorBidi" w:hAnsiTheme="majorBidi" w:cstheme="majorBidi"/>
+          <w:bCs/>
+          <w:sz w:val="18"/>
+          <w:szCs w:val="18"/>
+        </w:rPr>
+        <w:t> ;</w:t>
+      </w:r>
+      <w:r>
+        <w:t xml:space="preserve"> </w:t>
+      </w:r>
+      <w:r>
+        <w:rPr>
+          <w:rFonts w:asciiTheme="majorBidi" w:hAnsiTheme="majorBidi" w:cstheme="majorBidi"/>
+          <w:bCs/>
+          <w:sz w:val="18"/>
+          <w:szCs w:val="18"/>
+        </w:rPr>
+        <w:t>{{ ACTIVITY6 }}</w:t>
       </w:r>
     </w:p>
     <w:p>
@@ -559,15 +448,15 @@
         <w:ind w:left="567"/>
         <w:jc w:val="both"/>
         <w:rPr>
-          <w:rFonts w:asciiTheme="minorHAnsi" w:hAnsiTheme="minorHAnsi" w:cstheme="minorHAnsi"/>
-          <w:bCs/>
-          <w:sz w:val="18"/>
-          <w:szCs w:val="18"/>
-        </w:rPr>
-      </w:pPr>
-      <w:r>
-        <w:rPr>
-          <w:rFonts w:asciiTheme="minorHAnsi" w:hAnsiTheme="minorHAnsi" w:cstheme="minorHAnsi"/>
+          <w:rFonts w:asciiTheme="majorBidi" w:hAnsiTheme="majorBidi" w:cstheme="majorBidi"/>
+          <w:bCs/>
+          <w:sz w:val="18"/>
+          <w:szCs w:val="18"/>
+        </w:rPr>
+      </w:pPr>
+      <w:r>
+        <w:rPr>
+          <w:rFonts w:asciiTheme="majorBidi" w:hAnsiTheme="majorBidi" w:cstheme="majorBidi"/>
           <w:b/>
           <w:sz w:val="18"/>
           <w:szCs w:val="18"/>
@@ -575,54 +464,29 @@
         <w:t>Siège Social :</w:t>
       </w:r>
       <w:r>
-        <w:rPr>
-          <w:rFonts w:asciiTheme="minorHAnsi" w:hAnsiTheme="minorHAnsi" w:cstheme="minorHAnsi"/>
-        </w:rPr>
         <w:t xml:space="preserve"> </w:t>
       </w:r>
-      <w:proofErr w:type="gramStart"/>
-      <w:r>
-        <w:rPr>
-          <w:rFonts w:asciiTheme="minorHAnsi" w:hAnsiTheme="minorHAnsi" w:cstheme="minorHAnsi"/>
-          <w:bCs/>
-          <w:sz w:val="18"/>
-          <w:szCs w:val="18"/>
-        </w:rPr>
-        <w:t>{{ ADRESSE</w:t>
-      </w:r>
-      <w:proofErr w:type="gramEnd"/>
-      <w:r>
-        <w:rPr>
-          <w:rFonts w:asciiTheme="minorHAnsi" w:hAnsiTheme="minorHAnsi" w:cstheme="minorHAnsi"/>
-          <w:bCs/>
-          <w:sz w:val="18"/>
-          <w:szCs w:val="18"/>
-        </w:rPr>
-        <w:t>_SIEGE_</w:t>
-      </w:r>
-      <w:proofErr w:type="gramStart"/>
-      <w:r>
-        <w:rPr>
-          <w:rFonts w:asciiTheme="minorHAnsi" w:hAnsiTheme="minorHAnsi" w:cstheme="minorHAnsi"/>
-          <w:bCs/>
-          <w:sz w:val="18"/>
-          <w:szCs w:val="18"/>
-        </w:rPr>
-        <w:t>SOCIAL }</w:t>
-      </w:r>
-      <w:proofErr w:type="gramEnd"/>
-      <w:r>
-        <w:rPr>
-          <w:rFonts w:asciiTheme="minorHAnsi" w:hAnsiTheme="minorHAnsi" w:cstheme="minorHAnsi"/>
-          <w:bCs/>
-          <w:sz w:val="18"/>
-          <w:szCs w:val="18"/>
-        </w:rPr>
-        <w:t xml:space="preserve">} </w:t>
-      </w:r>
-      <w:r>
-        <w:rPr>
-          <w:rFonts w:asciiTheme="minorHAnsi" w:hAnsiTheme="minorHAnsi" w:cstheme="minorHAnsi"/>
+      <w:r>
+        <w:rPr>
+          <w:rFonts w:asciiTheme="majorBidi" w:hAnsiTheme="majorBidi" w:cstheme="majorBidi"/>
+          <w:bCs/>
+          <w:sz w:val="18"/>
+          <w:szCs w:val="18"/>
+        </w:rPr>
+        <w:t>{{ ADRESSE_SIEGE_SOCIAL }}</w:t>
+      </w:r>
+      <w:r>
+        <w:rPr>
+          <w:rFonts w:asciiTheme="majorBidi" w:hAnsiTheme="majorBidi" w:cstheme="majorBidi"/>
+          <w:bCs/>
+          <w:sz w:val="18"/>
+          <w:szCs w:val="18"/>
+        </w:rPr>
+        <w:t xml:space="preserve"> </w:t>
+      </w:r>
+      <w:r>
+        <w:rPr>
+          <w:rFonts w:asciiTheme="majorBidi" w:hAnsiTheme="majorBidi" w:cstheme="majorBidi"/>
           <w:bCs/>
           <w:sz w:val="18"/>
           <w:szCs w:val="18"/>
@@ -631,7 +495,7 @@
       </w:r>
       <w:r>
         <w:rPr>
-          <w:rFonts w:asciiTheme="minorHAnsi" w:hAnsiTheme="minorHAnsi" w:cstheme="minorHAnsi"/>
+          <w:rFonts w:asciiTheme="majorBidi" w:hAnsiTheme="majorBidi" w:cstheme="majorBidi"/>
           <w:bCs/>
           <w:sz w:val="18"/>
           <w:szCs w:val="18"/>
@@ -649,15 +513,15 @@
         <w:ind w:left="567"/>
         <w:jc w:val="both"/>
         <w:rPr>
-          <w:rFonts w:asciiTheme="minorHAnsi" w:hAnsiTheme="minorHAnsi" w:cstheme="minorHAnsi"/>
-          <w:bCs/>
-          <w:sz w:val="18"/>
-          <w:szCs w:val="18"/>
-        </w:rPr>
-      </w:pPr>
-      <w:r>
-        <w:rPr>
-          <w:rFonts w:asciiTheme="minorHAnsi" w:hAnsiTheme="minorHAnsi" w:cstheme="minorHAnsi"/>
+          <w:rFonts w:asciiTheme="majorBidi" w:hAnsiTheme="majorBidi" w:cstheme="majorBidi"/>
+          <w:bCs/>
+          <w:sz w:val="18"/>
+          <w:szCs w:val="18"/>
+        </w:rPr>
+      </w:pPr>
+      <w:r>
+        <w:rPr>
+          <w:rFonts w:asciiTheme="majorBidi" w:hAnsiTheme="majorBidi" w:cstheme="majorBidi"/>
           <w:b/>
           <w:sz w:val="18"/>
           <w:szCs w:val="18"/>
@@ -666,7 +530,7 @@
       </w:r>
       <w:r>
         <w:rPr>
-          <w:rFonts w:asciiTheme="minorHAnsi" w:hAnsiTheme="minorHAnsi" w:cstheme="minorHAnsi"/>
+          <w:rFonts w:asciiTheme="majorBidi" w:hAnsiTheme="majorBidi" w:cstheme="majorBidi"/>
           <w:bCs/>
           <w:sz w:val="18"/>
           <w:szCs w:val="18"/>
@@ -675,7 +539,7 @@
       </w:r>
       <w:r>
         <w:rPr>
-          <w:rFonts w:asciiTheme="minorHAnsi" w:hAnsiTheme="minorHAnsi" w:cstheme="minorHAnsi"/>
+          <w:rFonts w:asciiTheme="majorBidi" w:hAnsiTheme="majorBidi" w:cstheme="majorBidi"/>
           <w:bCs/>
           <w:sz w:val="18"/>
           <w:szCs w:val="18"/>
@@ -693,15 +557,15 @@
         <w:ind w:left="567"/>
         <w:jc w:val="both"/>
         <w:rPr>
-          <w:rFonts w:asciiTheme="minorHAnsi" w:hAnsiTheme="minorHAnsi" w:cstheme="minorHAnsi"/>
-          <w:bCs/>
-          <w:sz w:val="18"/>
-          <w:szCs w:val="18"/>
-        </w:rPr>
-      </w:pPr>
-      <w:r>
-        <w:rPr>
-          <w:rFonts w:asciiTheme="minorHAnsi" w:hAnsiTheme="minorHAnsi" w:cstheme="minorHAnsi"/>
+          <w:rFonts w:asciiTheme="majorBidi" w:hAnsiTheme="majorBidi" w:cstheme="majorBidi"/>
+          <w:bCs/>
+          <w:sz w:val="18"/>
+          <w:szCs w:val="18"/>
+        </w:rPr>
+      </w:pPr>
+      <w:r>
+        <w:rPr>
+          <w:rFonts w:asciiTheme="majorBidi" w:hAnsiTheme="majorBidi" w:cstheme="majorBidi"/>
           <w:b/>
           <w:sz w:val="18"/>
           <w:szCs w:val="18"/>
@@ -710,7 +574,7 @@
       </w:r>
       <w:r>
         <w:rPr>
-          <w:rFonts w:asciiTheme="minorHAnsi" w:hAnsiTheme="minorHAnsi" w:cstheme="minorHAnsi"/>
+          <w:rFonts w:asciiTheme="majorBidi" w:hAnsiTheme="majorBidi" w:cstheme="majorBidi"/>
           <w:b/>
           <w:sz w:val="18"/>
           <w:szCs w:val="18"/>
@@ -719,56 +583,25 @@
       </w:r>
       <w:r>
         <w:rPr>
-          <w:rFonts w:asciiTheme="minorHAnsi" w:hAnsiTheme="minorHAnsi" w:cstheme="minorHAnsi"/>
+          <w:rFonts w:asciiTheme="majorBidi" w:hAnsiTheme="majorBidi" w:cstheme="majorBidi"/>
           <w:bCs/>
           <w:sz w:val="18"/>
           <w:szCs w:val="18"/>
         </w:rPr>
         <w:t xml:space="preserve">s'élève à </w:t>
       </w:r>
-      <w:proofErr w:type="gramStart"/>
-      <w:r>
-        <w:rPr>
-          <w:rFonts w:asciiTheme="minorHAnsi" w:hAnsiTheme="minorHAnsi" w:cstheme="minorHAnsi"/>
-          <w:bCs/>
-          <w:sz w:val="18"/>
-          <w:szCs w:val="18"/>
-        </w:rPr>
-        <w:t>{{ CAPITAL</w:t>
-      </w:r>
-      <w:proofErr w:type="gramEnd"/>
-      <w:r>
-        <w:rPr>
-          <w:rFonts w:asciiTheme="minorHAnsi" w:hAnsiTheme="minorHAnsi" w:cstheme="minorHAnsi"/>
-          <w:bCs/>
-          <w:sz w:val="18"/>
-          <w:szCs w:val="18"/>
-        </w:rPr>
-        <w:t>_</w:t>
-      </w:r>
-      <w:proofErr w:type="gramStart"/>
-      <w:r>
-        <w:rPr>
-          <w:rFonts w:asciiTheme="minorHAnsi" w:hAnsiTheme="minorHAnsi" w:cstheme="minorHAnsi"/>
-          <w:bCs/>
-          <w:sz w:val="18"/>
-          <w:szCs w:val="18"/>
-        </w:rPr>
-        <w:t>SOCIAL }</w:t>
-      </w:r>
-      <w:proofErr w:type="gramEnd"/>
-      <w:r>
-        <w:rPr>
-          <w:rFonts w:asciiTheme="minorHAnsi" w:hAnsiTheme="minorHAnsi" w:cstheme="minorHAnsi"/>
-          <w:bCs/>
-          <w:sz w:val="18"/>
-          <w:szCs w:val="18"/>
-        </w:rPr>
-        <w:t>}</w:t>
-      </w:r>
-      <w:r>
-        <w:rPr>
-          <w:rFonts w:asciiTheme="minorHAnsi" w:hAnsiTheme="minorHAnsi" w:cstheme="minorHAnsi"/>
+      <w:r>
+        <w:rPr>
+          <w:rFonts w:asciiTheme="majorBidi" w:hAnsiTheme="majorBidi" w:cstheme="majorBidi"/>
+          <w:bCs/>
+          <w:sz w:val="18"/>
+          <w:szCs w:val="18"/>
+        </w:rPr>
+        <w:t>{{ CAPITAL_SOCIAL }}</w:t>
+      </w:r>
+      <w:r>
+        <w:rPr>
+          <w:rFonts w:asciiTheme="majorBidi" w:hAnsiTheme="majorBidi" w:cstheme="majorBidi"/>
           <w:bCs/>
           <w:sz w:val="18"/>
           <w:szCs w:val="18"/>
@@ -777,74 +610,54 @@
       </w:r>
       <w:r>
         <w:rPr>
-          <w:rFonts w:asciiTheme="minorHAnsi" w:hAnsiTheme="minorHAnsi" w:cstheme="minorHAnsi"/>
+          <w:rFonts w:asciiTheme="majorBidi" w:hAnsiTheme="majorBidi" w:cstheme="majorBidi"/>
           <w:bCs/>
           <w:sz w:val="18"/>
           <w:szCs w:val="18"/>
         </w:rPr>
         <w:t xml:space="preserve"> </w:t>
       </w:r>
-      <w:r>
-        <w:rPr>
-          <w:rFonts w:asciiTheme="minorHAnsi" w:hAnsiTheme="minorHAnsi" w:cstheme="minorHAnsi"/>
+      <w:proofErr w:type="spellStart"/>
+      <w:r>
+        <w:rPr>
+          <w:rFonts w:asciiTheme="majorBidi" w:hAnsiTheme="majorBidi" w:cstheme="majorBidi"/>
           <w:bCs/>
           <w:sz w:val="18"/>
           <w:szCs w:val="18"/>
         </w:rPr>
         <w:t>Dhs</w:t>
       </w:r>
-      <w:r>
-        <w:rPr>
-          <w:rFonts w:asciiTheme="minorHAnsi" w:hAnsiTheme="minorHAnsi" w:cstheme="minorHAnsi"/>
+      <w:proofErr w:type="spellEnd"/>
+      <w:r>
+        <w:rPr>
+          <w:rFonts w:asciiTheme="majorBidi" w:hAnsiTheme="majorBidi" w:cstheme="majorBidi"/>
           <w:bCs/>
           <w:sz w:val="18"/>
           <w:szCs w:val="18"/>
         </w:rPr>
         <w:t xml:space="preserve"> divisé en </w:t>
       </w:r>
-      <w:proofErr w:type="gramStart"/>
-      <w:r>
-        <w:rPr>
-          <w:rFonts w:asciiTheme="minorHAnsi" w:hAnsiTheme="minorHAnsi" w:cstheme="minorHAnsi"/>
-          <w:bCs/>
-          <w:sz w:val="18"/>
-          <w:szCs w:val="18"/>
-        </w:rPr>
-        <w:t>{{ NOMBRE</w:t>
-      </w:r>
-      <w:proofErr w:type="gramEnd"/>
-      <w:r>
-        <w:rPr>
-          <w:rFonts w:asciiTheme="minorHAnsi" w:hAnsiTheme="minorHAnsi" w:cstheme="minorHAnsi"/>
-          <w:bCs/>
-          <w:sz w:val="18"/>
-          <w:szCs w:val="18"/>
-        </w:rPr>
-        <w:t>_PARTS_</w:t>
-      </w:r>
-      <w:proofErr w:type="gramStart"/>
-      <w:r>
-        <w:rPr>
-          <w:rFonts w:asciiTheme="minorHAnsi" w:hAnsiTheme="minorHAnsi" w:cstheme="minorHAnsi"/>
-          <w:bCs/>
-          <w:sz w:val="18"/>
-          <w:szCs w:val="18"/>
-        </w:rPr>
-        <w:t>SOCIALES }</w:t>
-      </w:r>
-      <w:proofErr w:type="gramEnd"/>
-      <w:r>
-        <w:rPr>
-          <w:rFonts w:asciiTheme="minorHAnsi" w:hAnsiTheme="minorHAnsi" w:cstheme="minorHAnsi"/>
-          <w:bCs/>
-          <w:sz w:val="18"/>
-          <w:szCs w:val="18"/>
-        </w:rPr>
-        <w:t xml:space="preserve">} </w:t>
-      </w:r>
-      <w:r>
-        <w:rPr>
-          <w:rFonts w:asciiTheme="minorHAnsi" w:hAnsiTheme="minorHAnsi" w:cstheme="minorHAnsi"/>
+      <w:r>
+        <w:rPr>
+          <w:rFonts w:asciiTheme="majorBidi" w:hAnsiTheme="majorBidi" w:cstheme="majorBidi"/>
+          <w:bCs/>
+          <w:sz w:val="18"/>
+          <w:szCs w:val="18"/>
+        </w:rPr>
+        <w:t>{{ NOMBRE_PARTS_SOCIALES }}</w:t>
+      </w:r>
+      <w:r>
+        <w:rPr>
+          <w:rFonts w:asciiTheme="majorBidi" w:hAnsiTheme="majorBidi" w:cstheme="majorBidi"/>
+          <w:bCs/>
+          <w:sz w:val="18"/>
+          <w:szCs w:val="18"/>
+        </w:rPr>
+        <w:t xml:space="preserve"> </w:t>
+      </w:r>
+      <w:r>
+        <w:rPr>
+          <w:rFonts w:asciiTheme="majorBidi" w:hAnsiTheme="majorBidi" w:cstheme="majorBidi"/>
           <w:bCs/>
           <w:sz w:val="18"/>
           <w:szCs w:val="18"/>
@@ -853,7 +666,7 @@
       </w:r>
       <w:r>
         <w:rPr>
-          <w:rFonts w:asciiTheme="minorHAnsi" w:hAnsiTheme="minorHAnsi" w:cstheme="minorHAnsi"/>
+          <w:rFonts w:asciiTheme="majorBidi" w:hAnsiTheme="majorBidi" w:cstheme="majorBidi"/>
           <w:bCs/>
           <w:sz w:val="18"/>
           <w:szCs w:val="18"/>
@@ -862,7 +675,7 @@
       </w:r>
       <w:r>
         <w:rPr>
-          <w:rFonts w:asciiTheme="minorHAnsi" w:hAnsiTheme="minorHAnsi" w:cstheme="minorHAnsi"/>
+          <w:rFonts w:asciiTheme="majorBidi" w:hAnsiTheme="majorBidi" w:cstheme="majorBidi"/>
           <w:bCs/>
           <w:sz w:val="18"/>
           <w:szCs w:val="18"/>
@@ -871,7 +684,7 @@
       </w:r>
       <w:r>
         <w:rPr>
-          <w:rFonts w:asciiTheme="minorHAnsi" w:hAnsiTheme="minorHAnsi" w:cstheme="minorHAnsi"/>
+          <w:rFonts w:asciiTheme="majorBidi" w:hAnsiTheme="majorBidi" w:cstheme="majorBidi"/>
           <w:bCs/>
           <w:sz w:val="18"/>
           <w:szCs w:val="18"/>
@@ -880,7 +693,7 @@
       </w:r>
       <w:r>
         <w:rPr>
-          <w:rFonts w:asciiTheme="minorHAnsi" w:hAnsiTheme="minorHAnsi" w:cstheme="minorHAnsi"/>
+          <w:rFonts w:asciiTheme="majorBidi" w:hAnsiTheme="majorBidi" w:cstheme="majorBidi"/>
           <w:bCs/>
           <w:sz w:val="18"/>
           <w:szCs w:val="18"/>
@@ -889,7 +702,7 @@
       </w:r>
       <w:r>
         <w:rPr>
-          <w:rFonts w:asciiTheme="minorHAnsi" w:hAnsiTheme="minorHAnsi" w:cstheme="minorHAnsi"/>
+          <w:rFonts w:asciiTheme="majorBidi" w:hAnsiTheme="majorBidi" w:cstheme="majorBidi"/>
           <w:bCs/>
           <w:sz w:val="18"/>
           <w:szCs w:val="18"/>
@@ -898,7 +711,7 @@
       </w:r>
       <w:r>
         <w:rPr>
-          <w:rFonts w:asciiTheme="minorHAnsi" w:hAnsiTheme="minorHAnsi" w:cstheme="minorHAnsi"/>
+          <w:rFonts w:asciiTheme="majorBidi" w:hAnsiTheme="majorBidi" w:cstheme="majorBidi"/>
           <w:bCs/>
           <w:sz w:val="18"/>
           <w:szCs w:val="18"/>
@@ -907,7 +720,7 @@
       </w:r>
       <w:r>
         <w:rPr>
-          <w:rFonts w:asciiTheme="minorHAnsi" w:hAnsiTheme="minorHAnsi" w:cstheme="minorHAnsi"/>
+          <w:rFonts w:asciiTheme="majorBidi" w:hAnsiTheme="majorBidi" w:cstheme="majorBidi"/>
           <w:bCs/>
           <w:sz w:val="18"/>
           <w:szCs w:val="18"/>
@@ -916,7 +729,7 @@
       </w:r>
       <w:r>
         <w:rPr>
-          <w:rFonts w:asciiTheme="minorHAnsi" w:hAnsiTheme="minorHAnsi" w:cstheme="minorHAnsi"/>
+          <w:rFonts w:asciiTheme="majorBidi" w:hAnsiTheme="majorBidi" w:cstheme="majorBidi"/>
           <w:bCs/>
           <w:sz w:val="18"/>
           <w:szCs w:val="18"/>
@@ -925,7 +738,7 @@
       </w:r>
       <w:r>
         <w:rPr>
-          <w:rFonts w:asciiTheme="minorHAnsi" w:hAnsiTheme="minorHAnsi" w:cstheme="minorHAnsi"/>
+          <w:rFonts w:asciiTheme="majorBidi" w:hAnsiTheme="majorBidi" w:cstheme="majorBidi"/>
           <w:sz w:val="18"/>
           <w:szCs w:val="18"/>
           <w:lang w:val="fr-CA"/>
@@ -934,7 +747,7 @@
       </w:r>
       <w:r>
         <w:rPr>
-          <w:rFonts w:asciiTheme="minorHAnsi" w:hAnsiTheme="minorHAnsi" w:cstheme="minorHAnsi"/>
+          <w:rFonts w:asciiTheme="majorBidi" w:hAnsiTheme="majorBidi" w:cstheme="majorBidi"/>
           <w:sz w:val="18"/>
           <w:szCs w:val="18"/>
           <w:lang w:val="fr-CA"/>
@@ -947,135 +760,24 @@
         <w:ind w:left="207" w:firstLine="360"/>
         <w:jc w:val="both"/>
         <w:rPr>
-          <w:rFonts w:asciiTheme="minorHAnsi" w:hAnsiTheme="minorHAnsi" w:cstheme="minorHAnsi"/>
-          <w:b/>
-          <w:sz w:val="18"/>
-          <w:szCs w:val="18"/>
-        </w:rPr>
-      </w:pPr>
-      <w:proofErr w:type="gramStart"/>
-      <w:r>
-        <w:rPr>
-          <w:rFonts w:asciiTheme="minorHAnsi" w:hAnsiTheme="minorHAnsi" w:cstheme="minorHAnsi"/>
-          <w:b/>
-          <w:sz w:val="18"/>
-          <w:szCs w:val="18"/>
-        </w:rPr>
-        <w:t>{{ CIVILITE</w:t>
-      </w:r>
-      <w:proofErr w:type="gramEnd"/>
-      <w:r>
-        <w:rPr>
-          <w:rFonts w:asciiTheme="minorHAnsi" w:hAnsiTheme="minorHAnsi" w:cstheme="minorHAnsi"/>
-          <w:b/>
-          <w:sz w:val="18"/>
-          <w:szCs w:val="18"/>
-        </w:rPr>
-        <w:t>_</w:t>
-      </w:r>
-      <w:proofErr w:type="gramStart"/>
-      <w:r>
-        <w:rPr>
-          <w:rFonts w:asciiTheme="minorHAnsi" w:hAnsiTheme="minorHAnsi" w:cstheme="minorHAnsi"/>
-          <w:b/>
-          <w:sz w:val="18"/>
-          <w:szCs w:val="18"/>
-        </w:rPr>
-        <w:t>ASSOCIE }</w:t>
-      </w:r>
-      <w:proofErr w:type="gramEnd"/>
-      <w:r>
-        <w:rPr>
-          <w:rFonts w:asciiTheme="minorHAnsi" w:hAnsiTheme="minorHAnsi" w:cstheme="minorHAnsi"/>
-          <w:b/>
-          <w:sz w:val="18"/>
-          <w:szCs w:val="18"/>
-        </w:rPr>
-        <w:t xml:space="preserve">} </w:t>
-      </w:r>
-      <w:proofErr w:type="gramStart"/>
-      <w:r>
-        <w:rPr>
-          <w:rFonts w:asciiTheme="minorHAnsi" w:hAnsiTheme="minorHAnsi" w:cstheme="minorHAnsi"/>
-          <w:b/>
-          <w:sz w:val="18"/>
-          <w:szCs w:val="18"/>
-        </w:rPr>
-        <w:t>{{ PRENOM</w:t>
-      </w:r>
-      <w:proofErr w:type="gramEnd"/>
-      <w:r>
-        <w:rPr>
-          <w:rFonts w:asciiTheme="minorHAnsi" w:hAnsiTheme="minorHAnsi" w:cstheme="minorHAnsi"/>
-          <w:b/>
-          <w:sz w:val="18"/>
-          <w:szCs w:val="18"/>
-        </w:rPr>
-        <w:t>_</w:t>
-      </w:r>
-      <w:proofErr w:type="gramStart"/>
-      <w:r>
-        <w:rPr>
-          <w:rFonts w:asciiTheme="minorHAnsi" w:hAnsiTheme="minorHAnsi" w:cstheme="minorHAnsi"/>
-          <w:b/>
-          <w:sz w:val="18"/>
-          <w:szCs w:val="18"/>
-        </w:rPr>
-        <w:t>ASSOCIE }</w:t>
-      </w:r>
-      <w:proofErr w:type="gramEnd"/>
-      <w:r>
-        <w:rPr>
-          <w:rFonts w:asciiTheme="minorHAnsi" w:hAnsiTheme="minorHAnsi" w:cstheme="minorHAnsi"/>
-          <w:b/>
-          <w:sz w:val="18"/>
-          <w:szCs w:val="18"/>
-        </w:rPr>
-        <w:t xml:space="preserve">} </w:t>
-      </w:r>
-      <w:proofErr w:type="gramStart"/>
-      <w:r>
-        <w:rPr>
-          <w:rFonts w:asciiTheme="minorHAnsi" w:hAnsiTheme="minorHAnsi" w:cstheme="minorHAnsi"/>
-          <w:b/>
-          <w:sz w:val="18"/>
-          <w:szCs w:val="18"/>
-        </w:rPr>
-        <w:t>{{ NOM</w:t>
-      </w:r>
-      <w:proofErr w:type="gramEnd"/>
-      <w:r>
-        <w:rPr>
-          <w:rFonts w:asciiTheme="minorHAnsi" w:hAnsiTheme="minorHAnsi" w:cstheme="minorHAnsi"/>
-          <w:b/>
-          <w:sz w:val="18"/>
-          <w:szCs w:val="18"/>
-        </w:rPr>
-        <w:t>_</w:t>
-      </w:r>
-      <w:proofErr w:type="gramStart"/>
-      <w:r>
-        <w:rPr>
-          <w:rFonts w:asciiTheme="minorHAnsi" w:hAnsiTheme="minorHAnsi" w:cstheme="minorHAnsi"/>
-          <w:b/>
-          <w:sz w:val="18"/>
-          <w:szCs w:val="18"/>
-        </w:rPr>
-        <w:t>ASSOCIE }</w:t>
-      </w:r>
-      <w:proofErr w:type="gramEnd"/>
-      <w:r>
-        <w:rPr>
-          <w:rFonts w:asciiTheme="minorHAnsi" w:hAnsiTheme="minorHAnsi" w:cstheme="minorHAnsi"/>
-          <w:b/>
-          <w:sz w:val="18"/>
-          <w:szCs w:val="18"/>
-        </w:rPr>
-        <w:t>}</w:t>
-      </w:r>
-      <w:r>
-        <w:rPr>
-          <w:rFonts w:asciiTheme="minorHAnsi" w:hAnsiTheme="minorHAnsi" w:cstheme="minorHAnsi"/>
+          <w:rFonts w:asciiTheme="majorBidi" w:hAnsiTheme="majorBidi" w:cstheme="majorBidi"/>
+          <w:b/>
+          <w:sz w:val="18"/>
+          <w:szCs w:val="18"/>
+        </w:rPr>
+      </w:pPr>
+      <w:r>
+        <w:rPr>
+          <w:rFonts w:asciiTheme="majorBidi" w:hAnsiTheme="majorBidi" w:cstheme="majorBidi"/>
+          <w:b/>
+          <w:sz w:val="18"/>
+          <w:szCs w:val="18"/>
+        </w:rPr>
+        <w:t>{{ CIVILITE_ASSOCIE }}</w:t>
+      </w:r>
+      <w:r>
+        <w:rPr>
+          <w:rFonts w:asciiTheme="majorBidi" w:hAnsiTheme="majorBidi" w:cstheme="majorBidi"/>
           <w:b/>
           <w:sz w:val="18"/>
           <w:szCs w:val="18"/>
@@ -1084,7 +786,43 @@
       </w:r>
       <w:r>
         <w:rPr>
-          <w:rFonts w:asciiTheme="minorHAnsi" w:hAnsiTheme="minorHAnsi" w:cstheme="minorHAnsi"/>
+          <w:rFonts w:asciiTheme="majorBidi" w:hAnsiTheme="majorBidi" w:cstheme="majorBidi"/>
+          <w:b/>
+          <w:sz w:val="18"/>
+          <w:szCs w:val="18"/>
+        </w:rPr>
+        <w:t>{{ PRENOM_ASSOCIE }}</w:t>
+      </w:r>
+      <w:r>
+        <w:rPr>
+          <w:rFonts w:asciiTheme="majorBidi" w:hAnsiTheme="majorBidi" w:cstheme="majorBidi"/>
+          <w:b/>
+          <w:sz w:val="18"/>
+          <w:szCs w:val="18"/>
+        </w:rPr>
+        <w:t xml:space="preserve"> </w:t>
+      </w:r>
+      <w:r>
+        <w:rPr>
+          <w:rFonts w:asciiTheme="majorBidi" w:hAnsiTheme="majorBidi" w:cstheme="majorBidi"/>
+          <w:b/>
+          <w:sz w:val="18"/>
+          <w:szCs w:val="18"/>
+        </w:rPr>
+        <w:t>{{ NOM_ASSOCIE }}</w:t>
+      </w:r>
+      <w:r>
+        <w:rPr>
+          <w:rFonts w:asciiTheme="majorBidi" w:hAnsiTheme="majorBidi" w:cstheme="majorBidi"/>
+          <w:b/>
+          <w:sz w:val="18"/>
+          <w:szCs w:val="18"/>
+        </w:rPr>
+        <w:t xml:space="preserve"> </w:t>
+      </w:r>
+      <w:r>
+        <w:rPr>
+          <w:rFonts w:asciiTheme="majorBidi" w:hAnsiTheme="majorBidi" w:cstheme="majorBidi"/>
           <w:b/>
           <w:sz w:val="18"/>
           <w:szCs w:val="18"/>
@@ -1093,7 +831,7 @@
       </w:r>
       <w:r>
         <w:rPr>
-          <w:rFonts w:asciiTheme="minorHAnsi" w:hAnsiTheme="minorHAnsi" w:cstheme="minorHAnsi"/>
+          <w:rFonts w:asciiTheme="majorBidi" w:hAnsiTheme="majorBidi" w:cstheme="majorBidi"/>
           <w:b/>
           <w:sz w:val="18"/>
           <w:szCs w:val="18"/>
@@ -1102,7 +840,7 @@
       </w:r>
       <w:r>
         <w:rPr>
-          <w:rFonts w:asciiTheme="minorHAnsi" w:hAnsiTheme="minorHAnsi" w:cstheme="minorHAnsi"/>
+          <w:rFonts w:asciiTheme="majorBidi" w:hAnsiTheme="majorBidi" w:cstheme="majorBidi"/>
           <w:b/>
           <w:sz w:val="18"/>
           <w:szCs w:val="18"/>
@@ -1111,7 +849,7 @@
       </w:r>
       <w:r>
         <w:rPr>
-          <w:rFonts w:asciiTheme="minorHAnsi" w:hAnsiTheme="minorHAnsi" w:cstheme="minorHAnsi"/>
+          <w:rFonts w:asciiTheme="majorBidi" w:hAnsiTheme="majorBidi" w:cstheme="majorBidi"/>
           <w:b/>
           <w:sz w:val="18"/>
           <w:szCs w:val="18"/>
@@ -1120,56 +858,34 @@
       </w:r>
       <w:r>
         <w:rPr>
-          <w:rFonts w:asciiTheme="minorHAnsi" w:hAnsiTheme="minorHAnsi" w:cstheme="minorHAnsi"/>
+          <w:rFonts w:asciiTheme="majorBidi" w:hAnsiTheme="majorBidi" w:cstheme="majorBidi"/>
           <w:b/>
           <w:sz w:val="18"/>
           <w:szCs w:val="18"/>
         </w:rPr>
         <w:t>------</w:t>
       </w:r>
-      <w:proofErr w:type="gramStart"/>
-      <w:r>
-        <w:rPr>
-          <w:rFonts w:asciiTheme="minorHAnsi" w:hAnsiTheme="minorHAnsi" w:cstheme="minorHAnsi"/>
-          <w:b/>
-          <w:sz w:val="18"/>
-          <w:szCs w:val="18"/>
-        </w:rPr>
-        <w:t>{{ NOMBRE</w:t>
-      </w:r>
-      <w:proofErr w:type="gramEnd"/>
-      <w:r>
-        <w:rPr>
-          <w:rFonts w:asciiTheme="minorHAnsi" w:hAnsiTheme="minorHAnsi" w:cstheme="minorHAnsi"/>
-          <w:b/>
-          <w:sz w:val="18"/>
-          <w:szCs w:val="18"/>
-        </w:rPr>
-        <w:t>_PARTS_</w:t>
-      </w:r>
-      <w:proofErr w:type="gramStart"/>
-      <w:r>
-        <w:rPr>
-          <w:rFonts w:asciiTheme="minorHAnsi" w:hAnsiTheme="minorHAnsi" w:cstheme="minorHAnsi"/>
-          <w:b/>
-          <w:sz w:val="18"/>
-          <w:szCs w:val="18"/>
-        </w:rPr>
-        <w:t>SOCIALES }</w:t>
-      </w:r>
-      <w:proofErr w:type="gramEnd"/>
-      <w:r>
-        <w:rPr>
-          <w:rFonts w:asciiTheme="minorHAnsi" w:hAnsiTheme="minorHAnsi" w:cstheme="minorHAnsi"/>
-          <w:b/>
-          <w:sz w:val="18"/>
-          <w:szCs w:val="18"/>
-        </w:rPr>
-        <w:t xml:space="preserve">} </w:t>
-      </w:r>
-      <w:r>
-        <w:rPr>
-          <w:rFonts w:asciiTheme="minorHAnsi" w:hAnsiTheme="minorHAnsi" w:cstheme="minorHAnsi"/>
+      <w:r>
+        <w:rPr>
+          <w:rFonts w:asciiTheme="majorBidi" w:hAnsiTheme="majorBidi" w:cstheme="majorBidi"/>
+          <w:b/>
+          <w:sz w:val="18"/>
+          <w:szCs w:val="18"/>
+        </w:rPr>
+        <w:t>{{ NOMBRE_PARTS_SOCIALES }}</w:t>
+      </w:r>
+      <w:r>
+        <w:rPr>
+          <w:rFonts w:asciiTheme="majorBidi" w:hAnsiTheme="majorBidi" w:cstheme="majorBidi"/>
+          <w:b/>
+          <w:sz w:val="18"/>
+          <w:szCs w:val="18"/>
+        </w:rPr>
+        <w:t xml:space="preserve"> </w:t>
+      </w:r>
+      <w:r>
+        <w:rPr>
+          <w:rFonts w:asciiTheme="majorBidi" w:hAnsiTheme="majorBidi" w:cstheme="majorBidi"/>
           <w:b/>
           <w:sz w:val="18"/>
           <w:szCs w:val="18"/>
@@ -1183,15 +899,15 @@
         <w:ind w:left="567"/>
         <w:jc w:val="both"/>
         <w:rPr>
-          <w:rFonts w:asciiTheme="minorHAnsi" w:hAnsiTheme="minorHAnsi" w:cstheme="minorHAnsi"/>
-          <w:b/>
-          <w:sz w:val="18"/>
-          <w:szCs w:val="18"/>
-        </w:rPr>
-      </w:pPr>
-      <w:r>
-        <w:rPr>
-          <w:rFonts w:asciiTheme="minorHAnsi" w:hAnsiTheme="minorHAnsi" w:cstheme="minorHAnsi"/>
+          <w:rFonts w:asciiTheme="majorBidi" w:hAnsiTheme="majorBidi" w:cstheme="majorBidi"/>
+          <w:b/>
+          <w:sz w:val="18"/>
+          <w:szCs w:val="18"/>
+        </w:rPr>
+      </w:pPr>
+      <w:r>
+        <w:rPr>
+          <w:rFonts w:asciiTheme="majorBidi" w:hAnsiTheme="majorBidi" w:cstheme="majorBidi"/>
           <w:b/>
           <w:sz w:val="18"/>
           <w:szCs w:val="18"/>
@@ -1200,7 +916,7 @@
       </w:r>
       <w:r>
         <w:rPr>
-          <w:rFonts w:asciiTheme="minorHAnsi" w:hAnsiTheme="minorHAnsi" w:cstheme="minorHAnsi"/>
+          <w:rFonts w:asciiTheme="majorBidi" w:hAnsiTheme="majorBidi" w:cstheme="majorBidi"/>
           <w:b/>
           <w:sz w:val="18"/>
           <w:szCs w:val="18"/>
@@ -1209,7 +925,7 @@
       </w:r>
       <w:r>
         <w:rPr>
-          <w:rFonts w:asciiTheme="minorHAnsi" w:hAnsiTheme="minorHAnsi" w:cstheme="minorHAnsi"/>
+          <w:rFonts w:asciiTheme="majorBidi" w:hAnsiTheme="majorBidi" w:cstheme="majorBidi"/>
           <w:b/>
           <w:sz w:val="18"/>
           <w:szCs w:val="18"/>
@@ -1218,7 +934,7 @@
       </w:r>
       <w:r>
         <w:rPr>
-          <w:rFonts w:asciiTheme="minorHAnsi" w:hAnsiTheme="minorHAnsi" w:cstheme="minorHAnsi"/>
+          <w:rFonts w:asciiTheme="majorBidi" w:hAnsiTheme="majorBidi" w:cstheme="majorBidi"/>
           <w:b/>
           <w:sz w:val="18"/>
           <w:szCs w:val="18"/>
@@ -1227,7 +943,7 @@
       </w:r>
       <w:r>
         <w:rPr>
-          <w:rFonts w:asciiTheme="minorHAnsi" w:hAnsiTheme="minorHAnsi" w:cstheme="minorHAnsi"/>
+          <w:rFonts w:asciiTheme="majorBidi" w:hAnsiTheme="majorBidi" w:cstheme="majorBidi"/>
           <w:b/>
           <w:sz w:val="18"/>
           <w:szCs w:val="18"/>
@@ -1236,7 +952,7 @@
       </w:r>
       <w:r>
         <w:rPr>
-          <w:rFonts w:asciiTheme="minorHAnsi" w:hAnsiTheme="minorHAnsi" w:cstheme="minorHAnsi"/>
+          <w:rFonts w:asciiTheme="majorBidi" w:hAnsiTheme="majorBidi" w:cstheme="majorBidi"/>
           <w:b/>
           <w:sz w:val="18"/>
           <w:szCs w:val="18"/>
@@ -1245,56 +961,34 @@
       </w:r>
       <w:r>
         <w:rPr>
-          <w:rFonts w:asciiTheme="minorHAnsi" w:hAnsiTheme="minorHAnsi" w:cstheme="minorHAnsi"/>
+          <w:rFonts w:asciiTheme="majorBidi" w:hAnsiTheme="majorBidi" w:cstheme="majorBidi"/>
           <w:b/>
           <w:sz w:val="18"/>
           <w:szCs w:val="18"/>
         </w:rPr>
         <w:t>-</w:t>
       </w:r>
-      <w:proofErr w:type="gramStart"/>
-      <w:r>
-        <w:rPr>
-          <w:rFonts w:asciiTheme="minorHAnsi" w:hAnsiTheme="minorHAnsi" w:cstheme="minorHAnsi"/>
-          <w:b/>
-          <w:sz w:val="18"/>
-          <w:szCs w:val="18"/>
-        </w:rPr>
-        <w:t>{{ NOMBRE</w:t>
-      </w:r>
-      <w:proofErr w:type="gramEnd"/>
-      <w:r>
-        <w:rPr>
-          <w:rFonts w:asciiTheme="minorHAnsi" w:hAnsiTheme="minorHAnsi" w:cstheme="minorHAnsi"/>
-          <w:b/>
-          <w:sz w:val="18"/>
-          <w:szCs w:val="18"/>
-        </w:rPr>
-        <w:t>_PARTS_</w:t>
-      </w:r>
-      <w:proofErr w:type="gramStart"/>
-      <w:r>
-        <w:rPr>
-          <w:rFonts w:asciiTheme="minorHAnsi" w:hAnsiTheme="minorHAnsi" w:cstheme="minorHAnsi"/>
-          <w:b/>
-          <w:sz w:val="18"/>
-          <w:szCs w:val="18"/>
-        </w:rPr>
-        <w:t>SOCIALES }</w:t>
-      </w:r>
-      <w:proofErr w:type="gramEnd"/>
-      <w:r>
-        <w:rPr>
-          <w:rFonts w:asciiTheme="minorHAnsi" w:hAnsiTheme="minorHAnsi" w:cstheme="minorHAnsi"/>
-          <w:b/>
-          <w:sz w:val="18"/>
-          <w:szCs w:val="18"/>
-        </w:rPr>
-        <w:t xml:space="preserve">} </w:t>
-      </w:r>
-      <w:r>
-        <w:rPr>
-          <w:rFonts w:asciiTheme="minorHAnsi" w:hAnsiTheme="minorHAnsi" w:cstheme="minorHAnsi"/>
+      <w:r>
+        <w:rPr>
+          <w:rFonts w:asciiTheme="majorBidi" w:hAnsiTheme="majorBidi" w:cstheme="majorBidi"/>
+          <w:b/>
+          <w:sz w:val="18"/>
+          <w:szCs w:val="18"/>
+        </w:rPr>
+        <w:t>{{ NOMBRE_PARTS_SOCIALES }}</w:t>
+      </w:r>
+      <w:r>
+        <w:rPr>
+          <w:rFonts w:asciiTheme="majorBidi" w:hAnsiTheme="majorBidi" w:cstheme="majorBidi"/>
+          <w:b/>
+          <w:sz w:val="18"/>
+          <w:szCs w:val="18"/>
+        </w:rPr>
+        <w:t xml:space="preserve"> </w:t>
+      </w:r>
+      <w:r>
+        <w:rPr>
+          <w:rFonts w:asciiTheme="majorBidi" w:hAnsiTheme="majorBidi" w:cstheme="majorBidi"/>
           <w:b/>
           <w:sz w:val="18"/>
           <w:szCs w:val="18"/>
@@ -1312,15 +1006,15 @@
         <w:ind w:left="567"/>
         <w:jc w:val="both"/>
         <w:rPr>
-          <w:rFonts w:asciiTheme="minorHAnsi" w:hAnsiTheme="minorHAnsi" w:cstheme="minorHAnsi"/>
-          <w:bCs/>
-          <w:sz w:val="18"/>
-          <w:szCs w:val="18"/>
-        </w:rPr>
-      </w:pPr>
-      <w:r>
-        <w:rPr>
-          <w:rFonts w:asciiTheme="minorHAnsi" w:hAnsiTheme="minorHAnsi" w:cstheme="minorHAnsi"/>
+          <w:rFonts w:asciiTheme="majorBidi" w:hAnsiTheme="majorBidi" w:cstheme="majorBidi"/>
+          <w:bCs/>
+          <w:sz w:val="18"/>
+          <w:szCs w:val="18"/>
+        </w:rPr>
+      </w:pPr>
+      <w:r>
+        <w:rPr>
+          <w:rFonts w:asciiTheme="majorBidi" w:hAnsiTheme="majorBidi" w:cstheme="majorBidi"/>
           <w:b/>
           <w:sz w:val="18"/>
           <w:szCs w:val="18"/>
@@ -1329,7 +1023,7 @@
       </w:r>
       <w:r>
         <w:rPr>
-          <w:rFonts w:asciiTheme="minorHAnsi" w:hAnsiTheme="minorHAnsi" w:cstheme="minorHAnsi"/>
+          <w:rFonts w:asciiTheme="majorBidi" w:hAnsiTheme="majorBidi" w:cstheme="majorBidi"/>
           <w:b/>
           <w:sz w:val="18"/>
           <w:szCs w:val="18"/>
@@ -1338,7 +1032,7 @@
       </w:r>
       <w:r>
         <w:rPr>
-          <w:rFonts w:asciiTheme="minorHAnsi" w:hAnsiTheme="minorHAnsi" w:cstheme="minorHAnsi"/>
+          <w:rFonts w:asciiTheme="majorBidi" w:hAnsiTheme="majorBidi" w:cstheme="majorBidi"/>
           <w:b/>
           <w:sz w:val="18"/>
           <w:szCs w:val="18"/>
@@ -1347,7 +1041,7 @@
       </w:r>
       <w:r>
         <w:rPr>
-          <w:rFonts w:asciiTheme="minorHAnsi" w:hAnsiTheme="minorHAnsi" w:cstheme="minorHAnsi"/>
+          <w:rFonts w:asciiTheme="majorBidi" w:hAnsiTheme="majorBidi" w:cstheme="majorBidi"/>
           <w:b/>
           <w:sz w:val="18"/>
           <w:szCs w:val="18"/>
@@ -1356,7 +1050,7 @@
       </w:r>
       <w:r>
         <w:rPr>
-          <w:rFonts w:asciiTheme="minorHAnsi" w:hAnsiTheme="minorHAnsi" w:cstheme="minorHAnsi"/>
+          <w:rFonts w:asciiTheme="majorBidi" w:hAnsiTheme="majorBidi" w:cstheme="majorBidi"/>
           <w:bCs/>
           <w:sz w:val="18"/>
           <w:szCs w:val="18"/>
@@ -1365,141 +1059,39 @@
       </w:r>
       <w:r>
         <w:rPr>
-          <w:rFonts w:asciiTheme="minorHAnsi" w:hAnsiTheme="minorHAnsi" w:cstheme="minorHAnsi"/>
+          <w:rFonts w:asciiTheme="majorBidi" w:hAnsiTheme="majorBidi" w:cstheme="majorBidi"/>
           <w:bCs/>
           <w:sz w:val="18"/>
           <w:szCs w:val="18"/>
         </w:rPr>
         <w:t xml:space="preserve"> </w:t>
       </w:r>
-      <w:proofErr w:type="gramStart"/>
-      <w:r>
-        <w:rPr>
-          <w:rFonts w:asciiTheme="minorHAnsi" w:hAnsiTheme="minorHAnsi" w:cstheme="minorHAnsi"/>
-          <w:b/>
-          <w:sz w:val="18"/>
-          <w:szCs w:val="18"/>
-        </w:rPr>
-        <w:t>{{ CIVILITE</w:t>
-      </w:r>
-      <w:proofErr w:type="gramEnd"/>
-      <w:r>
-        <w:rPr>
-          <w:rFonts w:asciiTheme="minorHAnsi" w:hAnsiTheme="minorHAnsi" w:cstheme="minorHAnsi"/>
-          <w:b/>
-          <w:sz w:val="18"/>
-          <w:szCs w:val="18"/>
-        </w:rPr>
-        <w:t>_</w:t>
-      </w:r>
-      <w:proofErr w:type="gramStart"/>
-      <w:r>
-        <w:rPr>
-          <w:rFonts w:asciiTheme="minorHAnsi" w:hAnsiTheme="minorHAnsi" w:cstheme="minorHAnsi"/>
-          <w:b/>
-          <w:sz w:val="18"/>
-          <w:szCs w:val="18"/>
-        </w:rPr>
-        <w:t>ASSOCIE }</w:t>
-      </w:r>
-      <w:proofErr w:type="gramEnd"/>
-      <w:r>
-        <w:rPr>
-          <w:rFonts w:asciiTheme="minorHAnsi" w:hAnsiTheme="minorHAnsi" w:cstheme="minorHAnsi"/>
-          <w:b/>
-          <w:sz w:val="18"/>
-          <w:szCs w:val="18"/>
-        </w:rPr>
-        <w:t xml:space="preserve">} </w:t>
-      </w:r>
-      <w:proofErr w:type="gramStart"/>
-      <w:r>
-        <w:rPr>
-          <w:rFonts w:asciiTheme="minorHAnsi" w:hAnsiTheme="minorHAnsi" w:cstheme="minorHAnsi"/>
-          <w:b/>
-          <w:sz w:val="18"/>
-          <w:szCs w:val="18"/>
-        </w:rPr>
-        <w:t>{{ PRENOM</w:t>
-      </w:r>
-      <w:proofErr w:type="gramEnd"/>
-      <w:r>
-        <w:rPr>
-          <w:rFonts w:asciiTheme="minorHAnsi" w:hAnsiTheme="minorHAnsi" w:cstheme="minorHAnsi"/>
-          <w:b/>
-          <w:sz w:val="18"/>
-          <w:szCs w:val="18"/>
-        </w:rPr>
-        <w:t>_</w:t>
-      </w:r>
-      <w:proofErr w:type="gramStart"/>
-      <w:r>
-        <w:rPr>
-          <w:rFonts w:asciiTheme="minorHAnsi" w:hAnsiTheme="minorHAnsi" w:cstheme="minorHAnsi"/>
-          <w:b/>
-          <w:sz w:val="18"/>
-          <w:szCs w:val="18"/>
-        </w:rPr>
-        <w:t>ASSOCIE }</w:t>
-      </w:r>
-      <w:proofErr w:type="gramEnd"/>
-      <w:r>
-        <w:rPr>
-          <w:rFonts w:asciiTheme="minorHAnsi" w:hAnsiTheme="minorHAnsi" w:cstheme="minorHAnsi"/>
-          <w:b/>
-          <w:sz w:val="18"/>
-          <w:szCs w:val="18"/>
-        </w:rPr>
-        <w:t xml:space="preserve">} </w:t>
-      </w:r>
-      <w:proofErr w:type="gramStart"/>
-      <w:r>
-        <w:rPr>
-          <w:rFonts w:asciiTheme="minorHAnsi" w:hAnsiTheme="minorHAnsi" w:cstheme="minorHAnsi"/>
-          <w:b/>
-          <w:sz w:val="18"/>
-          <w:szCs w:val="18"/>
-        </w:rPr>
-        <w:t>{{ NOM</w:t>
-      </w:r>
-      <w:proofErr w:type="gramEnd"/>
-      <w:r>
-        <w:rPr>
-          <w:rFonts w:asciiTheme="minorHAnsi" w:hAnsiTheme="minorHAnsi" w:cstheme="minorHAnsi"/>
-          <w:b/>
-          <w:sz w:val="18"/>
-          <w:szCs w:val="18"/>
-        </w:rPr>
-        <w:t>_</w:t>
-      </w:r>
-      <w:proofErr w:type="gramStart"/>
-      <w:r>
-        <w:rPr>
-          <w:rFonts w:asciiTheme="minorHAnsi" w:hAnsiTheme="minorHAnsi" w:cstheme="minorHAnsi"/>
-          <w:b/>
-          <w:sz w:val="18"/>
-          <w:szCs w:val="18"/>
-        </w:rPr>
-        <w:t>ASSOCIE }</w:t>
-      </w:r>
-      <w:proofErr w:type="gramEnd"/>
-      <w:r>
-        <w:rPr>
-          <w:rFonts w:asciiTheme="minorHAnsi" w:hAnsiTheme="minorHAnsi" w:cstheme="minorHAnsi"/>
-          <w:b/>
-          <w:sz w:val="18"/>
-          <w:szCs w:val="18"/>
-        </w:rPr>
-        <w:t>}</w:t>
-      </w:r>
-      <w:r>
-        <w:rPr>
-          <w:rFonts w:asciiTheme="minorHAnsi" w:hAnsiTheme="minorHAnsi" w:cstheme="minorHAnsi"/>
-          <w:b/>
-          <w:sz w:val="18"/>
-          <w:szCs w:val="18"/>
-        </w:rPr>
-        <w:t xml:space="preserve">. </w:t>
+      <w:r>
+        <w:rPr>
+          <w:rFonts w:asciiTheme="majorBidi" w:hAnsiTheme="majorBidi" w:cstheme="majorBidi"/>
+          <w:b/>
+          <w:sz w:val="18"/>
+          <w:szCs w:val="18"/>
+        </w:rPr>
+        <w:t>{{ CIVILITE_ASSOCIE }} {{ PRENOM_ASSOCIE }} {{ NOM_ASSOCIE }}</w:t>
+      </w:r>
+      <w:r>
+        <w:rPr>
+          <w:rFonts w:asciiTheme="majorBidi" w:hAnsiTheme="majorBidi" w:cstheme="majorBidi"/>
+          <w:b/>
+          <w:sz w:val="18"/>
+          <w:szCs w:val="18"/>
+        </w:rPr>
+        <w:t>.</w:t>
+      </w:r>
+      <w:r>
+        <w:rPr>
+          <w:rFonts w:asciiTheme="majorBidi" w:hAnsiTheme="majorBidi" w:cstheme="majorBidi"/>
+          <w:b/>
+          <w:sz w:val="18"/>
+          <w:szCs w:val="18"/>
+        </w:rPr>
+        <w:t xml:space="preserve"> </w:t>
       </w:r>
     </w:p>
     <w:p>
@@ -1512,15 +1104,15 @@
         <w:ind w:left="567"/>
         <w:jc w:val="both"/>
         <w:rPr>
-          <w:rFonts w:asciiTheme="minorHAnsi" w:hAnsiTheme="minorHAnsi" w:cstheme="minorHAnsi"/>
-          <w:bCs/>
-          <w:sz w:val="18"/>
-          <w:szCs w:val="18"/>
-        </w:rPr>
-      </w:pPr>
-      <w:r>
-        <w:rPr>
-          <w:rFonts w:asciiTheme="minorHAnsi" w:hAnsiTheme="minorHAnsi" w:cstheme="minorHAnsi"/>
+          <w:rFonts w:asciiTheme="majorBidi" w:hAnsiTheme="majorBidi" w:cstheme="majorBidi"/>
+          <w:bCs/>
+          <w:sz w:val="18"/>
+          <w:szCs w:val="18"/>
+        </w:rPr>
+      </w:pPr>
+      <w:r>
+        <w:rPr>
+          <w:rFonts w:asciiTheme="majorBidi" w:hAnsiTheme="majorBidi" w:cstheme="majorBidi"/>
           <w:b/>
           <w:sz w:val="18"/>
           <w:szCs w:val="18"/>
@@ -1529,7 +1121,7 @@
       </w:r>
       <w:r>
         <w:rPr>
-          <w:rFonts w:asciiTheme="minorHAnsi" w:hAnsiTheme="minorHAnsi" w:cstheme="minorHAnsi"/>
+          <w:rFonts w:asciiTheme="majorBidi" w:hAnsiTheme="majorBidi" w:cstheme="majorBidi"/>
           <w:b/>
           <w:sz w:val="18"/>
           <w:szCs w:val="18"/>
@@ -1538,7 +1130,7 @@
       </w:r>
       <w:r>
         <w:rPr>
-          <w:rFonts w:asciiTheme="minorHAnsi" w:hAnsiTheme="minorHAnsi" w:cstheme="minorHAnsi"/>
+          <w:rFonts w:asciiTheme="majorBidi" w:hAnsiTheme="majorBidi" w:cstheme="majorBidi"/>
           <w:b/>
           <w:sz w:val="18"/>
           <w:szCs w:val="18"/>
@@ -1547,7 +1139,7 @@
       </w:r>
       <w:r>
         <w:rPr>
-          <w:rFonts w:asciiTheme="minorHAnsi" w:hAnsiTheme="minorHAnsi" w:cstheme="minorHAnsi"/>
+          <w:rFonts w:asciiTheme="majorBidi" w:hAnsiTheme="majorBidi" w:cstheme="majorBidi"/>
           <w:bCs/>
           <w:sz w:val="18"/>
           <w:szCs w:val="18"/>
@@ -1556,7 +1148,7 @@
       </w:r>
       <w:r>
         <w:rPr>
-          <w:rFonts w:asciiTheme="minorHAnsi" w:hAnsiTheme="minorHAnsi" w:cstheme="minorHAnsi"/>
+          <w:rFonts w:asciiTheme="majorBidi" w:hAnsiTheme="majorBidi" w:cstheme="majorBidi"/>
           <w:bCs/>
           <w:sz w:val="18"/>
           <w:szCs w:val="18"/>
@@ -1565,7 +1157,7 @@
       </w:r>
       <w:r>
         <w:rPr>
-          <w:rFonts w:asciiTheme="minorHAnsi" w:hAnsiTheme="minorHAnsi" w:cstheme="minorHAnsi"/>
+          <w:rFonts w:asciiTheme="majorBidi" w:hAnsiTheme="majorBidi" w:cstheme="majorBidi"/>
           <w:bCs/>
           <w:sz w:val="18"/>
           <w:szCs w:val="18"/>
@@ -1574,7 +1166,7 @@
       </w:r>
       <w:r>
         <w:rPr>
-          <w:rFonts w:asciiTheme="minorHAnsi" w:hAnsiTheme="minorHAnsi" w:cstheme="minorHAnsi"/>
+          <w:rFonts w:asciiTheme="majorBidi" w:hAnsiTheme="majorBidi" w:cstheme="majorBidi"/>
           <w:bCs/>
           <w:sz w:val="18"/>
           <w:szCs w:val="18"/>
@@ -1583,7 +1175,7 @@
       </w:r>
       <w:r>
         <w:rPr>
-          <w:rFonts w:asciiTheme="minorHAnsi" w:hAnsiTheme="minorHAnsi" w:cstheme="minorHAnsi"/>
+          <w:rFonts w:asciiTheme="majorBidi" w:hAnsiTheme="majorBidi" w:cstheme="majorBidi"/>
           <w:bCs/>
           <w:sz w:val="18"/>
           <w:szCs w:val="18"/>
@@ -1597,7 +1189,7 @@
         <w:ind w:left="567"/>
         <w:jc w:val="both"/>
         <w:rPr>
-          <w:rFonts w:asciiTheme="minorHAnsi" w:hAnsiTheme="minorHAnsi" w:cstheme="minorHAnsi"/>
+          <w:rFonts w:asciiTheme="majorBidi" w:hAnsiTheme="majorBidi" w:cstheme="majorBidi"/>
           <w:bCs/>
           <w:sz w:val="18"/>
           <w:szCs w:val="18"/>
@@ -1609,15 +1201,15 @@
     <w:p>
       <w:pPr>
         <w:rPr>
-          <w:rFonts w:asciiTheme="minorHAnsi" w:hAnsiTheme="minorHAnsi" w:cstheme="minorHAnsi"/>
-          <w:b/>
-          <w:sz w:val="18"/>
-          <w:szCs w:val="18"/>
-        </w:rPr>
-      </w:pPr>
-      <w:r>
-        <w:rPr>
-          <w:rFonts w:asciiTheme="minorHAnsi" w:hAnsiTheme="minorHAnsi" w:cstheme="minorHAnsi"/>
+          <w:rFonts w:asciiTheme="majorBidi" w:hAnsiTheme="majorBidi" w:cstheme="majorBidi"/>
+          <w:b/>
+          <w:sz w:val="18"/>
+          <w:szCs w:val="18"/>
+        </w:rPr>
+      </w:pPr>
+      <w:r>
+        <w:rPr>
+          <w:rFonts w:asciiTheme="majorBidi" w:hAnsiTheme="majorBidi" w:cstheme="majorBidi"/>
           <w:b/>
           <w:sz w:val="18"/>
           <w:szCs w:val="18"/>
@@ -1626,7 +1218,7 @@
       </w:r>
       <w:r>
         <w:rPr>
-          <w:rFonts w:asciiTheme="minorHAnsi" w:hAnsiTheme="minorHAnsi" w:cstheme="minorHAnsi"/>
+          <w:rFonts w:asciiTheme="majorBidi" w:hAnsiTheme="majorBidi" w:cstheme="majorBidi"/>
           <w:b/>
           <w:sz w:val="18"/>
           <w:szCs w:val="18"/>
@@ -1635,7 +1227,7 @@
       </w:r>
       <w:r>
         <w:rPr>
-          <w:rFonts w:asciiTheme="minorHAnsi" w:hAnsiTheme="minorHAnsi" w:cstheme="minorHAnsi"/>
+          <w:rFonts w:asciiTheme="majorBidi" w:hAnsiTheme="majorBidi" w:cstheme="majorBidi"/>
           <w:bCs/>
           <w:sz w:val="18"/>
           <w:szCs w:val="18"/>
@@ -1644,7 +1236,7 @@
       </w:r>
       <w:r>
         <w:rPr>
-          <w:rFonts w:asciiTheme="minorHAnsi" w:hAnsiTheme="minorHAnsi" w:cstheme="minorHAnsi"/>
+          <w:rFonts w:asciiTheme="majorBidi" w:hAnsiTheme="majorBidi" w:cstheme="majorBidi"/>
           <w:bCs/>
           <w:sz w:val="18"/>
           <w:szCs w:val="18"/>
@@ -1653,7 +1245,7 @@
       </w:r>
       <w:r>
         <w:rPr>
-          <w:rFonts w:asciiTheme="minorHAnsi" w:hAnsiTheme="minorHAnsi" w:cstheme="minorHAnsi"/>
+          <w:rFonts w:asciiTheme="majorBidi" w:hAnsiTheme="majorBidi" w:cstheme="majorBidi"/>
           <w:bCs/>
           <w:sz w:val="18"/>
           <w:szCs w:val="18"/>
@@ -1662,7 +1254,7 @@
       </w:r>
       <w:r>
         <w:rPr>
-          <w:rFonts w:asciiTheme="minorHAnsi" w:hAnsiTheme="minorHAnsi" w:cstheme="minorHAnsi"/>
+          <w:rFonts w:asciiTheme="majorBidi" w:hAnsiTheme="majorBidi" w:cstheme="majorBidi"/>
           <w:bCs/>
           <w:sz w:val="18"/>
           <w:szCs w:val="18"/>
@@ -1671,7 +1263,7 @@
       </w:r>
       <w:r>
         <w:rPr>
-          <w:rFonts w:asciiTheme="minorHAnsi" w:hAnsiTheme="minorHAnsi" w:cstheme="minorHAnsi"/>
+          <w:rFonts w:asciiTheme="majorBidi" w:hAnsiTheme="majorBidi" w:cstheme="majorBidi"/>
           <w:bCs/>
           <w:sz w:val="18"/>
           <w:szCs w:val="18"/>
@@ -1680,7 +1272,7 @@
       </w:r>
       <w:r>
         <w:rPr>
-          <w:rFonts w:asciiTheme="minorHAnsi" w:hAnsiTheme="minorHAnsi" w:cstheme="minorHAnsi"/>
+          <w:rFonts w:asciiTheme="majorBidi" w:hAnsiTheme="majorBidi" w:cstheme="majorBidi"/>
           <w:bCs/>
           <w:sz w:val="18"/>
           <w:szCs w:val="18"/>
@@ -1689,7 +1281,7 @@
       </w:r>
       <w:r>
         <w:rPr>
-          <w:rFonts w:asciiTheme="minorHAnsi" w:hAnsiTheme="minorHAnsi" w:cstheme="minorHAnsi"/>
+          <w:rFonts w:asciiTheme="majorBidi" w:hAnsiTheme="majorBidi" w:cstheme="majorBidi"/>
           <w:bCs/>
           <w:sz w:val="18"/>
           <w:szCs w:val="18"/>
@@ -1698,7 +1290,7 @@
       </w:r>
       <w:r>
         <w:rPr>
-          <w:rFonts w:asciiTheme="minorHAnsi" w:hAnsiTheme="minorHAnsi" w:cstheme="minorHAnsi"/>
+          <w:rFonts w:asciiTheme="majorBidi" w:hAnsiTheme="majorBidi" w:cstheme="majorBidi"/>
           <w:bCs/>
           <w:sz w:val="18"/>
           <w:szCs w:val="18"/>
@@ -1707,7 +1299,7 @@
       </w:r>
       <w:r>
         <w:rPr>
-          <w:rFonts w:asciiTheme="minorHAnsi" w:hAnsiTheme="minorHAnsi" w:cstheme="minorHAnsi"/>
+          <w:rFonts w:asciiTheme="majorBidi" w:hAnsiTheme="majorBidi" w:cstheme="majorBidi"/>
           <w:b/>
           <w:sz w:val="18"/>
           <w:szCs w:val="18"/>
@@ -1716,56 +1308,25 @@
       </w:r>
       <w:r>
         <w:rPr>
-          <w:rFonts w:asciiTheme="minorHAnsi" w:hAnsiTheme="minorHAnsi" w:cstheme="minorHAnsi"/>
+          <w:rFonts w:asciiTheme="majorBidi" w:hAnsiTheme="majorBidi" w:cstheme="majorBidi"/>
           <w:b/>
           <w:sz w:val="18"/>
           <w:szCs w:val="18"/>
         </w:rPr>
         <w:t xml:space="preserve"> </w:t>
       </w:r>
-      <w:proofErr w:type="gramStart"/>
-      <w:r>
-        <w:rPr>
-          <w:rFonts w:asciiTheme="minorHAnsi" w:hAnsiTheme="minorHAnsi" w:cstheme="minorHAnsi"/>
-          <w:b/>
-          <w:sz w:val="18"/>
-          <w:szCs w:val="18"/>
-        </w:rPr>
-        <w:t>{{ NUM</w:t>
-      </w:r>
-      <w:proofErr w:type="gramEnd"/>
-      <w:r>
-        <w:rPr>
-          <w:rFonts w:asciiTheme="minorHAnsi" w:hAnsiTheme="minorHAnsi" w:cstheme="minorHAnsi"/>
-          <w:b/>
-          <w:sz w:val="18"/>
-          <w:szCs w:val="18"/>
-        </w:rPr>
-        <w:t>_DEPOT_</w:t>
-      </w:r>
-      <w:proofErr w:type="gramStart"/>
-      <w:r>
-        <w:rPr>
-          <w:rFonts w:asciiTheme="minorHAnsi" w:hAnsiTheme="minorHAnsi" w:cstheme="minorHAnsi"/>
-          <w:b/>
-          <w:sz w:val="18"/>
-          <w:szCs w:val="18"/>
-        </w:rPr>
-        <w:t>RC }</w:t>
-      </w:r>
-      <w:proofErr w:type="gramEnd"/>
-      <w:r>
-        <w:rPr>
-          <w:rFonts w:asciiTheme="minorHAnsi" w:hAnsiTheme="minorHAnsi" w:cstheme="minorHAnsi"/>
-          <w:b/>
-          <w:sz w:val="18"/>
-          <w:szCs w:val="18"/>
-        </w:rPr>
-        <w:t>}</w:t>
-      </w:r>
-      <w:r>
-        <w:rPr>
-          <w:rFonts w:asciiTheme="minorHAnsi" w:hAnsiTheme="minorHAnsi" w:cstheme="minorHAnsi"/>
+      <w:r>
+        <w:rPr>
+          <w:rFonts w:asciiTheme="majorBidi" w:hAnsiTheme="majorBidi" w:cstheme="majorBidi"/>
+          <w:b/>
+          <w:sz w:val="18"/>
+          <w:szCs w:val="18"/>
+        </w:rPr>
+        <w:t>{{ NUM_DEPOT_RC }}</w:t>
+      </w:r>
+      <w:r>
+        <w:rPr>
+          <w:rFonts w:asciiTheme="majorBidi" w:hAnsiTheme="majorBidi" w:cstheme="majorBidi"/>
           <w:bCs/>
           <w:sz w:val="18"/>
           <w:szCs w:val="18"/>
@@ -1774,7 +1335,7 @@
       </w:r>
       <w:r>
         <w:rPr>
-          <w:rFonts w:asciiTheme="minorHAnsi" w:hAnsiTheme="minorHAnsi" w:cstheme="minorHAnsi"/>
+          <w:rFonts w:asciiTheme="majorBidi" w:hAnsiTheme="majorBidi" w:cstheme="majorBidi"/>
           <w:bCs/>
           <w:sz w:val="18"/>
           <w:szCs w:val="18"/>
@@ -1783,7 +1344,7 @@
       </w:r>
       <w:r>
         <w:rPr>
-          <w:rFonts w:asciiTheme="minorHAnsi" w:hAnsiTheme="minorHAnsi" w:cstheme="minorHAnsi"/>
+          <w:rFonts w:asciiTheme="majorBidi" w:hAnsiTheme="majorBidi" w:cstheme="majorBidi"/>
           <w:bCs/>
           <w:sz w:val="18"/>
           <w:szCs w:val="18"/>
@@ -1792,7 +1353,7 @@
       </w:r>
       <w:r>
         <w:rPr>
-          <w:rFonts w:asciiTheme="minorHAnsi" w:hAnsiTheme="minorHAnsi" w:cstheme="minorHAnsi"/>
+          <w:rFonts w:asciiTheme="majorBidi" w:hAnsiTheme="majorBidi" w:cstheme="majorBidi"/>
           <w:bCs/>
           <w:sz w:val="18"/>
           <w:szCs w:val="18"/>
@@ -1801,7 +1362,7 @@
       </w:r>
       <w:r>
         <w:rPr>
-          <w:rFonts w:asciiTheme="minorHAnsi" w:hAnsiTheme="minorHAnsi" w:cstheme="minorHAnsi"/>
+          <w:rFonts w:asciiTheme="majorBidi" w:hAnsiTheme="majorBidi" w:cstheme="majorBidi"/>
           <w:bCs/>
           <w:sz w:val="18"/>
           <w:szCs w:val="18"/>
@@ -1810,56 +1371,34 @@
       </w:r>
       <w:r>
         <w:rPr>
-          <w:rFonts w:asciiTheme="minorHAnsi" w:hAnsiTheme="minorHAnsi" w:cstheme="minorHAnsi"/>
+          <w:rFonts w:asciiTheme="majorBidi" w:hAnsiTheme="majorBidi" w:cstheme="majorBidi"/>
           <w:bCs/>
           <w:sz w:val="18"/>
           <w:szCs w:val="18"/>
         </w:rPr>
         <w:t xml:space="preserve">° </w:t>
       </w:r>
-      <w:proofErr w:type="gramStart"/>
-      <w:r>
-        <w:rPr>
-          <w:rFonts w:asciiTheme="minorHAnsi" w:hAnsiTheme="minorHAnsi" w:cstheme="minorHAnsi"/>
-          <w:b/>
-          <w:sz w:val="18"/>
-          <w:szCs w:val="18"/>
-        </w:rPr>
-        <w:t>{{ NUM</w:t>
-      </w:r>
-      <w:proofErr w:type="gramEnd"/>
-      <w:r>
-        <w:rPr>
-          <w:rFonts w:asciiTheme="minorHAnsi" w:hAnsiTheme="minorHAnsi" w:cstheme="minorHAnsi"/>
-          <w:b/>
-          <w:sz w:val="18"/>
-          <w:szCs w:val="18"/>
-        </w:rPr>
-        <w:t>_</w:t>
-      </w:r>
-      <w:proofErr w:type="gramStart"/>
-      <w:r>
-        <w:rPr>
-          <w:rFonts w:asciiTheme="minorHAnsi" w:hAnsiTheme="minorHAnsi" w:cstheme="minorHAnsi"/>
-          <w:b/>
-          <w:sz w:val="18"/>
-          <w:szCs w:val="18"/>
-        </w:rPr>
-        <w:t>RC }</w:t>
-      </w:r>
-      <w:proofErr w:type="gramEnd"/>
-      <w:r>
-        <w:rPr>
-          <w:rFonts w:asciiTheme="minorHAnsi" w:hAnsiTheme="minorHAnsi" w:cstheme="minorHAnsi"/>
-          <w:b/>
-          <w:sz w:val="18"/>
-          <w:szCs w:val="18"/>
-        </w:rPr>
-        <w:t xml:space="preserve">} </w:t>
-      </w:r>
-      <w:r>
-        <w:rPr>
-          <w:rFonts w:asciiTheme="minorHAnsi" w:hAnsiTheme="minorHAnsi" w:cstheme="minorHAnsi"/>
+      <w:r>
+        <w:rPr>
+          <w:rFonts w:asciiTheme="majorBidi" w:hAnsiTheme="majorBidi" w:cstheme="majorBidi"/>
+          <w:b/>
+          <w:sz w:val="18"/>
+          <w:szCs w:val="18"/>
+        </w:rPr>
+        <w:t>{{ NUM_RC }}</w:t>
+      </w:r>
+      <w:r>
+        <w:rPr>
+          <w:rFonts w:asciiTheme="majorBidi" w:hAnsiTheme="majorBidi" w:cstheme="majorBidi"/>
+          <w:b/>
+          <w:sz w:val="18"/>
+          <w:szCs w:val="18"/>
+        </w:rPr>
+        <w:t xml:space="preserve"> </w:t>
+      </w:r>
+      <w:r>
+        <w:rPr>
+          <w:rFonts w:asciiTheme="majorBidi" w:hAnsiTheme="majorBidi" w:cstheme="majorBidi"/>
           <w:bCs/>
           <w:sz w:val="18"/>
           <w:szCs w:val="18"/>
@@ -1868,56 +1407,25 @@
       </w:r>
       <w:r>
         <w:rPr>
-          <w:rFonts w:asciiTheme="minorHAnsi" w:hAnsiTheme="minorHAnsi" w:cstheme="minorHAnsi"/>
+          <w:rFonts w:asciiTheme="majorBidi" w:hAnsiTheme="majorBidi" w:cstheme="majorBidi"/>
           <w:b/>
           <w:sz w:val="18"/>
           <w:szCs w:val="18"/>
         </w:rPr>
         <w:t xml:space="preserve"> </w:t>
       </w:r>
-      <w:proofErr w:type="gramStart"/>
-      <w:r>
-        <w:rPr>
-          <w:rFonts w:asciiTheme="minorHAnsi" w:hAnsiTheme="minorHAnsi" w:cstheme="minorHAnsi"/>
-          <w:b/>
-          <w:sz w:val="18"/>
-          <w:szCs w:val="18"/>
-        </w:rPr>
-        <w:t>{{ DTAE</w:t>
-      </w:r>
-      <w:proofErr w:type="gramEnd"/>
-      <w:r>
-        <w:rPr>
-          <w:rFonts w:asciiTheme="minorHAnsi" w:hAnsiTheme="minorHAnsi" w:cstheme="minorHAnsi"/>
-          <w:b/>
-          <w:sz w:val="18"/>
-          <w:szCs w:val="18"/>
-        </w:rPr>
-        <w:t>_</w:t>
-      </w:r>
-      <w:proofErr w:type="gramStart"/>
-      <w:r>
-        <w:rPr>
-          <w:rFonts w:asciiTheme="minorHAnsi" w:hAnsiTheme="minorHAnsi" w:cstheme="minorHAnsi"/>
-          <w:b/>
-          <w:sz w:val="18"/>
-          <w:szCs w:val="18"/>
-        </w:rPr>
-        <w:t>CONTRAT }</w:t>
-      </w:r>
-      <w:proofErr w:type="gramEnd"/>
-      <w:r>
-        <w:rPr>
-          <w:rFonts w:asciiTheme="minorHAnsi" w:hAnsiTheme="minorHAnsi" w:cstheme="minorHAnsi"/>
-          <w:b/>
-          <w:sz w:val="18"/>
-          <w:szCs w:val="18"/>
-        </w:rPr>
-        <w:t>}</w:t>
-      </w:r>
-      <w:r>
-        <w:rPr>
-          <w:rFonts w:asciiTheme="minorHAnsi" w:hAnsiTheme="minorHAnsi" w:cstheme="minorHAnsi"/>
+      <w:r>
+        <w:rPr>
+          <w:rFonts w:asciiTheme="majorBidi" w:hAnsiTheme="majorBidi" w:cstheme="majorBidi"/>
+          <w:b/>
+          <w:sz w:val="18"/>
+          <w:szCs w:val="18"/>
+        </w:rPr>
+        <w:t>{{ DTAE_CONTRAT }}</w:t>
+      </w:r>
+      <w:r>
+        <w:rPr>
+          <w:rFonts w:asciiTheme="majorBidi" w:hAnsiTheme="majorBidi" w:cstheme="majorBidi"/>
           <w:b/>
           <w:sz w:val="18"/>
           <w:szCs w:val="18"/>
@@ -1929,7 +1437,7 @@
       <w:pPr>
         <w:jc w:val="both"/>
         <w:rPr>
-          <w:rFonts w:asciiTheme="minorHAnsi" w:hAnsiTheme="minorHAnsi" w:cstheme="minorHAnsi"/>
+          <w:rFonts w:asciiTheme="majorBidi" w:hAnsiTheme="majorBidi" w:cstheme="majorBidi"/>
           <w:bCs/>
           <w:sz w:val="18"/>
           <w:szCs w:val="18"/>
@@ -1943,7 +1451,7 @@
         </w:tabs>
         <w:jc w:val="both"/>
         <w:rPr>
-          <w:rFonts w:asciiTheme="minorHAnsi" w:hAnsiTheme="minorHAnsi" w:cstheme="minorHAnsi"/>
+          <w:rFonts w:asciiTheme="majorBidi" w:hAnsiTheme="majorBidi" w:cstheme="majorBidi"/>
           <w:bCs/>
           <w:sz w:val="18"/>
           <w:szCs w:val="18"/>
@@ -1961,7 +1469,7 @@
 </file>
 
 <file path=word/endnotes.xml><?xml version="1.0" encoding="utf-8"?>
-<w:endnotes xmlns:wpc="http://schemas.microsoft.com/office/word/2010/wordprocessingCanvas" xmlns:cx="http://schemas.microsoft.com/office/drawing/2014/chartex" xmlns:cx1="http://schemas.microsoft.com/office/drawing/2015/9/8/chartex" xmlns:cx2="http://schemas.microsoft.com/office/drawing/2015/10/21/chartex" xmlns:cx3="http://schemas.microsoft.com/office/drawing/2016/5/9/chartex" xmlns:cx4="http://schemas.microsoft.com/office/drawing/2016/5/10/chartex" xmlns:cx5="http://schemas.microsoft.com/office/drawing/2016/5/11/chartex" xmlns:cx6="http://schemas.microsoft.com/office/drawing/2016/5/12/chartex" xmlns:cx7="http://schemas.microsoft.com/office/drawing/2016/5/13/chartex" xmlns:cx8="http://schemas.microsoft.com/office/drawing/2016/5/14/chartex" xmlns:mc="http://schemas.openxmlformats.org/markup-compatibility/2006" xmlns:aink="http://schemas.microsoft.com/office/drawing/2016/ink" xmlns:am3d="http://schemas.microsoft.com/office/drawing/2017/model3d" xmlns:o="urn:schemas-microsoft-com:office:office" xmlns:oel="http://schemas.microsoft.com/office/2019/extlst" xmlns:r="http://schemas.openxmlformats.org/officeDocument/2006/relationships" xmlns:m="http://schemas.openxmlformats.org/officeDocument/2006/math" xmlns:v="urn:schemas-microsoft-com:vml" xmlns:wp14="http://schemas.microsoft.com/office/word/2010/wordprocessingDrawing" xmlns:wp="http://schemas.openxmlformats.org/drawingml/2006/wordprocessingDrawing" xmlns:w10="urn:schemas-microsoft-com:office:word" xmlns:w="http://schemas.openxmlformats.org/wordprocessingml/2006/main" xmlns:w14="http://schemas.microsoft.com/office/word/2010/wordml" xmlns:w15="http://schemas.microsoft.com/office/word/2012/wordml" xmlns:w16cex="http://schemas.microsoft.com/office/word/2018/wordml/cex" xmlns:w16cid="http://schemas.microsoft.com/office/word/2016/wordml/cid" xmlns:w16="http://schemas.microsoft.com/office/word/2018/wordml" xmlns:w16du="http://schemas.microsoft.com/office/word/2023/wordml/word16du" xmlns:w16sdtdh="http://schemas.microsoft.com/office/word/2020/wordml/sdtdatahash" xmlns:w16sdtfl="http://schemas.microsoft.com/office/word/2024/wordml/sdtformatlock" xmlns:w16se="http://schemas.microsoft.com/office/word/2015/wordml/symex" xmlns:wpg="http://schemas.microsoft.com/office/word/2010/wordprocessingGroup" xmlns:wpi="http://schemas.microsoft.com/office/word/2010/wordprocessingInk" xmlns:wne="http://schemas.microsoft.com/office/word/2006/wordml" xmlns:wps="http://schemas.microsoft.com/office/word/2010/wordprocessingShape" mc:Ignorable="w14 w15 w16se w16cid w16 w16cex w16sdtdh w16sdtfl w16du wp14">
+<w:endnotes xmlns:wpc="http://schemas.microsoft.com/office/word/2010/wordprocessingCanvas" xmlns:cx="http://schemas.microsoft.com/office/drawing/2014/chartex" xmlns:cx1="http://schemas.microsoft.com/office/drawing/2015/9/8/chartex" xmlns:cx2="http://schemas.microsoft.com/office/drawing/2015/10/21/chartex" xmlns:cx3="http://schemas.microsoft.com/office/drawing/2016/5/9/chartex" xmlns:cx4="http://schemas.microsoft.com/office/drawing/2016/5/10/chartex" xmlns:cx5="http://schemas.microsoft.com/office/drawing/2016/5/11/chartex" xmlns:cx6="http://schemas.microsoft.com/office/drawing/2016/5/12/chartex" xmlns:cx7="http://schemas.microsoft.com/office/drawing/2016/5/13/chartex" xmlns:cx8="http://schemas.microsoft.com/office/drawing/2016/5/14/chartex" xmlns:mc="http://schemas.openxmlformats.org/markup-compatibility/2006" xmlns:aink="http://schemas.microsoft.com/office/drawing/2016/ink" xmlns:am3d="http://schemas.microsoft.com/office/drawing/2017/model3d" xmlns:o="urn:schemas-microsoft-com:office:office" xmlns:oel="http://schemas.microsoft.com/office/2019/extlst" xmlns:r="http://schemas.openxmlformats.org/officeDocument/2006/relationships" xmlns:m="http://schemas.openxmlformats.org/officeDocument/2006/math" xmlns:v="urn:schemas-microsoft-com:vml" xmlns:wp14="http://schemas.microsoft.com/office/word/2010/wordprocessingDrawing" xmlns:wp="http://schemas.openxmlformats.org/drawingml/2006/wordprocessingDrawing" xmlns:w10="urn:schemas-microsoft-com:office:word" xmlns:w="http://schemas.openxmlformats.org/wordprocessingml/2006/main" xmlns:w14="http://schemas.microsoft.com/office/word/2010/wordml" xmlns:w15="http://schemas.microsoft.com/office/word/2012/wordml" xmlns:w16cex="http://schemas.microsoft.com/office/word/2018/wordml/cex" xmlns:w16cid="http://schemas.microsoft.com/office/word/2016/wordml/cid" xmlns:w16="http://schemas.microsoft.com/office/word/2018/wordml" xmlns:w16sdtdh="http://schemas.microsoft.com/office/word/2020/wordml/sdtdatahash" xmlns:w16se="http://schemas.microsoft.com/office/word/2015/wordml/symex" xmlns:wpg="http://schemas.microsoft.com/office/word/2010/wordprocessingGroup" xmlns:wpi="http://schemas.microsoft.com/office/word/2010/wordprocessingInk" xmlns:wne="http://schemas.microsoft.com/office/word/2006/wordml" xmlns:wps="http://schemas.microsoft.com/office/word/2010/wordprocessingShape" mc:Ignorable="w14 w15 w16se w16cid w16 w16cex w16sdtdh wp14">
   <w:endnote w:type="separator" w:id="-1">
     <w:p>
       <w:r>
@@ -1980,7 +1488,7 @@
 </file>
 
 <file path=word/footnotes.xml><?xml version="1.0" encoding="utf-8"?>
-<w:footnotes xmlns:wpc="http://schemas.microsoft.com/office/word/2010/wordprocessingCanvas" xmlns:cx="http://schemas.microsoft.com/office/drawing/2014/chartex" xmlns:cx1="http://schemas.microsoft.com/office/drawing/2015/9/8/chartex" xmlns:cx2="http://schemas.microsoft.com/office/drawing/2015/10/21/chartex" xmlns:cx3="http://schemas.microsoft.com/office/drawing/2016/5/9/chartex" xmlns:cx4="http://schemas.microsoft.com/office/drawing/2016/5/10/chartex" xmlns:cx5="http://schemas.microsoft.com/office/drawing/2016/5/11/chartex" xmlns:cx6="http://schemas.microsoft.com/office/drawing/2016/5/12/chartex" xmlns:cx7="http://schemas.microsoft.com/office/drawing/2016/5/13/chartex" xmlns:cx8="http://schemas.microsoft.com/office/drawing/2016/5/14/chartex" xmlns:mc="http://schemas.openxmlformats.org/markup-compatibility/2006" xmlns:aink="http://schemas.microsoft.com/office/drawing/2016/ink" xmlns:am3d="http://schemas.microsoft.com/office/drawing/2017/model3d" xmlns:o="urn:schemas-microsoft-com:office:office" xmlns:oel="http://schemas.microsoft.com/office/2019/extlst" xmlns:r="http://schemas.openxmlformats.org/officeDocument/2006/relationships" xmlns:m="http://schemas.openxmlformats.org/officeDocument/2006/math" xmlns:v="urn:schemas-microsoft-com:vml" xmlns:wp14="http://schemas.microsoft.com/office/word/2010/wordprocessingDrawing" xmlns:wp="http://schemas.openxmlformats.org/drawingml/2006/wordprocessingDrawing" xmlns:w10="urn:schemas-microsoft-com:office:word" xmlns:w="http://schemas.openxmlformats.org/wordprocessingml/2006/main" xmlns:w14="http://schemas.microsoft.com/office/word/2010/wordml" xmlns:w15="http://schemas.microsoft.com/office/word/2012/wordml" xmlns:w16cex="http://schemas.microsoft.com/office/word/2018/wordml/cex" xmlns:w16cid="http://schemas.microsoft.com/office/word/2016/wordml/cid" xmlns:w16="http://schemas.microsoft.com/office/word/2018/wordml" xmlns:w16du="http://schemas.microsoft.com/office/word/2023/wordml/word16du" xmlns:w16sdtdh="http://schemas.microsoft.com/office/word/2020/wordml/sdtdatahash" xmlns:w16sdtfl="http://schemas.microsoft.com/office/word/2024/wordml/sdtformatlock" xmlns:w16se="http://schemas.microsoft.com/office/word/2015/wordml/symex" xmlns:wpg="http://schemas.microsoft.com/office/word/2010/wordprocessingGroup" xmlns:wpi="http://schemas.microsoft.com/office/word/2010/wordprocessingInk" xmlns:wne="http://schemas.microsoft.com/office/word/2006/wordml" xmlns:wps="http://schemas.microsoft.com/office/word/2010/wordprocessingShape" mc:Ignorable="w14 w15 w16se w16cid w16 w16cex w16sdtdh w16sdtfl w16du wp14">
+<w:footnotes xmlns:wpc="http://schemas.microsoft.com/office/word/2010/wordprocessingCanvas" xmlns:cx="http://schemas.microsoft.com/office/drawing/2014/chartex" xmlns:cx1="http://schemas.microsoft.com/office/drawing/2015/9/8/chartex" xmlns:cx2="http://schemas.microsoft.com/office/drawing/2015/10/21/chartex" xmlns:cx3="http://schemas.microsoft.com/office/drawing/2016/5/9/chartex" xmlns:cx4="http://schemas.microsoft.com/office/drawing/2016/5/10/chartex" xmlns:cx5="http://schemas.microsoft.com/office/drawing/2016/5/11/chartex" xmlns:cx6="http://schemas.microsoft.com/office/drawing/2016/5/12/chartex" xmlns:cx7="http://schemas.microsoft.com/office/drawing/2016/5/13/chartex" xmlns:cx8="http://schemas.microsoft.com/office/drawing/2016/5/14/chartex" xmlns:mc="http://schemas.openxmlformats.org/markup-compatibility/2006" xmlns:aink="http://schemas.microsoft.com/office/drawing/2016/ink" xmlns:am3d="http://schemas.microsoft.com/office/drawing/2017/model3d" xmlns:o="urn:schemas-microsoft-com:office:office" xmlns:oel="http://schemas.microsoft.com/office/2019/extlst" xmlns:r="http://schemas.openxmlformats.org/officeDocument/2006/relationships" xmlns:m="http://schemas.openxmlformats.org/officeDocument/2006/math" xmlns:v="urn:schemas-microsoft-com:vml" xmlns:wp14="http://schemas.microsoft.com/office/word/2010/wordprocessingDrawing" xmlns:wp="http://schemas.openxmlformats.org/drawingml/2006/wordprocessingDrawing" xmlns:w10="urn:schemas-microsoft-com:office:word" xmlns:w="http://schemas.openxmlformats.org/wordprocessingml/2006/main" xmlns:w14="http://schemas.microsoft.com/office/word/2010/wordml" xmlns:w15="http://schemas.microsoft.com/office/word/2012/wordml" xmlns:w16cex="http://schemas.microsoft.com/office/word/2018/wordml/cex" xmlns:w16cid="http://schemas.microsoft.com/office/word/2016/wordml/cid" xmlns:w16="http://schemas.microsoft.com/office/word/2018/wordml" xmlns:w16sdtdh="http://schemas.microsoft.com/office/word/2020/wordml/sdtdatahash" xmlns:w16se="http://schemas.microsoft.com/office/word/2015/wordml/symex" xmlns:wpg="http://schemas.microsoft.com/office/word/2010/wordprocessingGroup" xmlns:wpi="http://schemas.microsoft.com/office/word/2010/wordprocessingInk" xmlns:wne="http://schemas.microsoft.com/office/word/2006/wordml" xmlns:wps="http://schemas.microsoft.com/office/word/2010/wordprocessingShape" mc:Ignorable="w14 w15 w16se w16cid w16 w16cex w16sdtdh wp14">
   <w:footnote w:type="separator" w:id="-1">
     <w:p>
       <w:r>
@@ -1999,7 +1507,7 @@
 </file>
 
 <file path=word/numbering.xml><?xml version="1.0" encoding="utf-8"?>
-<w:numbering xmlns:wpc="http://schemas.microsoft.com/office/word/2010/wordprocessingCanvas" xmlns:cx="http://schemas.microsoft.com/office/drawing/2014/chartex" xmlns:cx1="http://schemas.microsoft.com/office/drawing/2015/9/8/chartex" xmlns:cx2="http://schemas.microsoft.com/office/drawing/2015/10/21/chartex" xmlns:cx3="http://schemas.microsoft.com/office/drawing/2016/5/9/chartex" xmlns:cx4="http://schemas.microsoft.com/office/drawing/2016/5/10/chartex" xmlns:cx5="http://schemas.microsoft.com/office/drawing/2016/5/11/chartex" xmlns:cx6="http://schemas.microsoft.com/office/drawing/2016/5/12/chartex" xmlns:cx7="http://schemas.microsoft.com/office/drawing/2016/5/13/chartex" xmlns:cx8="http://schemas.microsoft.com/office/drawing/2016/5/14/chartex" xmlns:mc="http://schemas.openxmlformats.org/markup-compatibility/2006" xmlns:aink="http://schemas.microsoft.com/office/drawing/2016/ink" xmlns:am3d="http://schemas.microsoft.com/office/drawing/2017/model3d" xmlns:o="urn:schemas-microsoft-com:office:office" xmlns:oel="http://schemas.microsoft.com/office/2019/extlst" xmlns:r="http://schemas.openxmlformats.org/officeDocument/2006/relationships" xmlns:m="http://schemas.openxmlformats.org/officeDocument/2006/math" xmlns:v="urn:schemas-microsoft-com:vml" xmlns:wp14="http://schemas.microsoft.com/office/word/2010/wordprocessingDrawing" xmlns:wp="http://schemas.openxmlformats.org/drawingml/2006/wordprocessingDrawing" xmlns:w10="urn:schemas-microsoft-com:office:word" xmlns:w="http://schemas.openxmlformats.org/wordprocessingml/2006/main" xmlns:w14="http://schemas.microsoft.com/office/word/2010/wordml" xmlns:w15="http://schemas.microsoft.com/office/word/2012/wordml" xmlns:w16cex="http://schemas.microsoft.com/office/word/2018/wordml/cex" xmlns:w16cid="http://schemas.microsoft.com/office/word/2016/wordml/cid" xmlns:w16="http://schemas.microsoft.com/office/word/2018/wordml" xmlns:w16du="http://schemas.microsoft.com/office/word/2023/wordml/word16du" xmlns:w16sdtdh="http://schemas.microsoft.com/office/word/2020/wordml/sdtdatahash" xmlns:w16sdtfl="http://schemas.microsoft.com/office/word/2024/wordml/sdtformatlock" xmlns:w16se="http://schemas.microsoft.com/office/word/2015/wordml/symex" xmlns:wpg="http://schemas.microsoft.com/office/word/2010/wordprocessingGroup" xmlns:wpi="http://schemas.microsoft.com/office/word/2010/wordprocessingInk" xmlns:wne="http://schemas.microsoft.com/office/word/2006/wordml" xmlns:wps="http://schemas.microsoft.com/office/word/2010/wordprocessingShape" mc:Ignorable="w14 w15 w16se w16cid w16 w16cex w16sdtdh w16sdtfl w16du wp14">
+<w:numbering xmlns:wpc="http://schemas.microsoft.com/office/word/2010/wordprocessingCanvas" xmlns:cx="http://schemas.microsoft.com/office/drawing/2014/chartex" xmlns:cx1="http://schemas.microsoft.com/office/drawing/2015/9/8/chartex" xmlns:cx2="http://schemas.microsoft.com/office/drawing/2015/10/21/chartex" xmlns:cx3="http://schemas.microsoft.com/office/drawing/2016/5/9/chartex" xmlns:cx4="http://schemas.microsoft.com/office/drawing/2016/5/10/chartex" xmlns:cx5="http://schemas.microsoft.com/office/drawing/2016/5/11/chartex" xmlns:cx6="http://schemas.microsoft.com/office/drawing/2016/5/12/chartex" xmlns:cx7="http://schemas.microsoft.com/office/drawing/2016/5/13/chartex" xmlns:cx8="http://schemas.microsoft.com/office/drawing/2016/5/14/chartex" xmlns:mc="http://schemas.openxmlformats.org/markup-compatibility/2006" xmlns:aink="http://schemas.microsoft.com/office/drawing/2016/ink" xmlns:am3d="http://schemas.microsoft.com/office/drawing/2017/model3d" xmlns:o="urn:schemas-microsoft-com:office:office" xmlns:oel="http://schemas.microsoft.com/office/2019/extlst" xmlns:r="http://schemas.openxmlformats.org/officeDocument/2006/relationships" xmlns:m="http://schemas.openxmlformats.org/officeDocument/2006/math" xmlns:v="urn:schemas-microsoft-com:vml" xmlns:wp14="http://schemas.microsoft.com/office/word/2010/wordprocessingDrawing" xmlns:wp="http://schemas.openxmlformats.org/drawingml/2006/wordprocessingDrawing" xmlns:w10="urn:schemas-microsoft-com:office:word" xmlns:w="http://schemas.openxmlformats.org/wordprocessingml/2006/main" xmlns:w14="http://schemas.microsoft.com/office/word/2010/wordml" xmlns:w15="http://schemas.microsoft.com/office/word/2012/wordml" xmlns:w16cex="http://schemas.microsoft.com/office/word/2018/wordml/cex" xmlns:w16cid="http://schemas.microsoft.com/office/word/2016/wordml/cid" xmlns:w16="http://schemas.microsoft.com/office/word/2018/wordml" xmlns:w16sdtdh="http://schemas.microsoft.com/office/word/2020/wordml/sdtdatahash" xmlns:w16se="http://schemas.microsoft.com/office/word/2015/wordml/symex" xmlns:wpg="http://schemas.microsoft.com/office/word/2010/wordprocessingGroup" xmlns:wpi="http://schemas.microsoft.com/office/word/2010/wordprocessingInk" xmlns:wne="http://schemas.microsoft.com/office/word/2006/wordml" xmlns:wps="http://schemas.microsoft.com/office/word/2010/wordprocessingShape" mc:Ignorable="w14 w15 w16se w16cid w16 w16cex w16sdtdh wp14">
   <w:numPicBullet w:numPicBulletId="0">
     <w:pict>
       <v:shapetype id="_x0000_t75" coordsize="21600,21600" o:spt="75" o:preferrelative="t" path="m@4@5l@4@11@9@11@9@5xe" filled="f" stroked="f">
@@ -2021,14 +1529,14 @@
         <v:path o:extrusionok="f" gradientshapeok="t" o:connecttype="rect"/>
         <o:lock v:ext="edit" aspectratio="t"/>
       </v:shapetype>
-      <v:shape id="_x0000_i1025" type="#_x0000_t75" style="width:11.25pt;height:11.25pt" o:bullet="t">
+      <v:shape id="_x0000_i1038" type="#_x0000_t75" style="width:11.25pt;height:11.25pt" o:bullet="t">
         <v:imagedata r:id="rId1" o:title="msoFA43"/>
       </v:shape>
     </w:pict>
   </w:numPicBullet>
   <w:numPicBullet w:numPicBulletId="1">
     <w:pict>
-      <v:shape id="_x0000_i1026" type="#_x0000_t75" style="width:11.25pt;height:11.25pt" o:bullet="t">
+      <v:shape id="_x0000_i1039" type="#_x0000_t75" style="width:11.25pt;height:11.25pt" o:bullet="t">
         <v:imagedata r:id="rId2" o:title="msoFA43"/>
       </v:shape>
     </w:pict>
@@ -3434,7 +2942,7 @@
 </file>
 
 <file path=word/styles.xml><?xml version="1.0" encoding="utf-8"?>
-<w:styles xmlns:mc="http://schemas.openxmlformats.org/markup-compatibility/2006" xmlns:r="http://schemas.openxmlformats.org/officeDocument/2006/relationships" xmlns:w="http://schemas.openxmlformats.org/wordprocessingml/2006/main" xmlns:w14="http://schemas.microsoft.com/office/word/2010/wordml" xmlns:w15="http://schemas.microsoft.com/office/word/2012/wordml" xmlns:w16cex="http://schemas.microsoft.com/office/word/2018/wordml/cex" xmlns:w16cid="http://schemas.microsoft.com/office/word/2016/wordml/cid" xmlns:w16="http://schemas.microsoft.com/office/word/2018/wordml" xmlns:w16du="http://schemas.microsoft.com/office/word/2023/wordml/word16du" xmlns:w16sdtdh="http://schemas.microsoft.com/office/word/2020/wordml/sdtdatahash" xmlns:w16sdtfl="http://schemas.microsoft.com/office/word/2024/wordml/sdtformatlock" xmlns:w16se="http://schemas.microsoft.com/office/word/2015/wordml/symex" mc:Ignorable="w14 w15 w16se w16cid w16 w16cex w16sdtdh w16sdtfl w16du">
+<w:styles xmlns:mc="http://schemas.openxmlformats.org/markup-compatibility/2006" xmlns:r="http://schemas.openxmlformats.org/officeDocument/2006/relationships" xmlns:w="http://schemas.openxmlformats.org/wordprocessingml/2006/main" xmlns:w14="http://schemas.microsoft.com/office/word/2010/wordml" xmlns:w15="http://schemas.microsoft.com/office/word/2012/wordml" xmlns:w16cex="http://schemas.microsoft.com/office/word/2018/wordml/cex" xmlns:w16cid="http://schemas.microsoft.com/office/word/2016/wordml/cid" xmlns:w16="http://schemas.microsoft.com/office/word/2018/wordml" xmlns:w16sdtdh="http://schemas.microsoft.com/office/word/2020/wordml/sdtdatahash" xmlns:w16se="http://schemas.microsoft.com/office/word/2015/wordml/symex" mc:Ignorable="w14 w15 w16se w16cid w16 w16cex w16sdtdh">
   <w:docDefaults>
     <w:rPrDefault>
       <w:rPr>

</xml_diff>